<commit_message>
nmv 04 07 2026
</commit_message>
<xml_diff>
--- a/TS-Kramam/TS-5.2/TS 5.2 Malayalam Krama Paatam Corrections.docx
+++ b/TS-Kramam/TS-5.2/TS 5.2 Malayalam Krama Paatam Corrections.docx
@@ -81,9 +81,8 @@
           <w:szCs w:val="32"/>
           <w:u w:val="single"/>
         </w:rPr>
-        <w:t xml:space="preserve">Observed </w:t>
+        <w:t xml:space="preserve">Observed till </w:t>
       </w:r>
-      <w:proofErr w:type="gramStart"/>
       <w:r>
         <w:rPr>
           <w:b/>
@@ -92,20 +91,8 @@
           <w:szCs w:val="32"/>
           <w:u w:val="single"/>
         </w:rPr>
-        <w:t xml:space="preserve">till </w:t>
+        <w:t>31st July 2026</w:t>
       </w:r>
-      <w:r>
-        <w:rPr>
-          <w:b/>
-          <w:bCs/>
-          <w:sz w:val="32"/>
-          <w:szCs w:val="32"/>
-          <w:highlight w:val="red"/>
-          <w:u w:val="single"/>
-        </w:rPr>
-        <w:t>????</w:t>
-      </w:r>
-      <w:proofErr w:type="gramEnd"/>
     </w:p>
     <w:p>
       <w:pPr>
@@ -247,6 +234,1158 @@
       </w:tr>
       <w:tr>
         <w:trPr>
+          <w:trHeight w:val="1671"/>
+        </w:trPr>
+        <w:tc>
+          <w:tcPr>
+            <w:tcW w:w="3906" w:type="dxa"/>
+          </w:tcPr>
+          <w:p>
+            <w:pPr>
+              <w:widowControl w:val="0"/>
+              <w:tabs>
+                <w:tab w:val="left" w:pos="993"/>
+              </w:tabs>
+              <w:autoSpaceDE w:val="0"/>
+              <w:autoSpaceDN w:val="0"/>
+              <w:adjustRightInd w:val="0"/>
+              <w:spacing w:before="0" w:line="240" w:lineRule="auto"/>
+              <w:ind w:right="297"/>
+              <w:rPr>
+                <w:rFonts w:cs="Arial"/>
+                <w:b/>
+                <w:sz w:val="28"/>
+                <w:szCs w:val="32"/>
+              </w:rPr>
+            </w:pPr>
+            <w:r>
+              <w:rPr>
+                <w:rFonts w:cs="Arial"/>
+                <w:b/>
+                <w:sz w:val="28"/>
+                <w:szCs w:val="32"/>
+              </w:rPr>
+              <w:t>T.S.5.2.</w:t>
+            </w:r>
+            <w:r>
+              <w:rPr>
+                <w:rFonts w:cs="Arial"/>
+                <w:b/>
+                <w:sz w:val="28"/>
+                <w:szCs w:val="32"/>
+              </w:rPr>
+              <w:t>1.6</w:t>
+            </w:r>
+            <w:r>
+              <w:rPr>
+                <w:rFonts w:cs="Arial"/>
+                <w:b/>
+                <w:sz w:val="28"/>
+                <w:szCs w:val="32"/>
+              </w:rPr>
+              <w:t xml:space="preserve"> – Kramam</w:t>
+            </w:r>
+          </w:p>
+          <w:p>
+            <w:pPr>
+              <w:widowControl w:val="0"/>
+              <w:tabs>
+                <w:tab w:val="left" w:pos="993"/>
+              </w:tabs>
+              <w:autoSpaceDE w:val="0"/>
+              <w:autoSpaceDN w:val="0"/>
+              <w:adjustRightInd w:val="0"/>
+              <w:spacing w:before="0" w:line="240" w:lineRule="auto"/>
+              <w:ind w:right="297"/>
+              <w:rPr>
+                <w:rFonts w:cs="Arial"/>
+                <w:b/>
+                <w:sz w:val="28"/>
+                <w:szCs w:val="32"/>
+                <w:lang w:val="en-IN"/>
+              </w:rPr>
+            </w:pPr>
+            <w:r>
+              <w:rPr>
+                <w:rFonts w:cs="Arial"/>
+                <w:b/>
+                <w:sz w:val="28"/>
+                <w:szCs w:val="32"/>
+                <w:lang w:val="en-IN"/>
+              </w:rPr>
+              <w:t xml:space="preserve">Krama Vaakyam No.– </w:t>
+            </w:r>
+            <w:r>
+              <w:rPr>
+                <w:rFonts w:cs="Arial"/>
+                <w:b/>
+                <w:sz w:val="28"/>
+                <w:szCs w:val="32"/>
+                <w:lang w:val="en-IN"/>
+              </w:rPr>
+              <w:t>1,2,3</w:t>
+            </w:r>
+          </w:p>
+          <w:p>
+            <w:pPr>
+              <w:widowControl w:val="0"/>
+              <w:tabs>
+                <w:tab w:val="left" w:pos="993"/>
+              </w:tabs>
+              <w:autoSpaceDE w:val="0"/>
+              <w:autoSpaceDN w:val="0"/>
+              <w:adjustRightInd w:val="0"/>
+              <w:spacing w:before="0" w:line="240" w:lineRule="auto"/>
+              <w:ind w:right="297"/>
+              <w:rPr>
+                <w:rFonts w:cs="Arial"/>
+                <w:b/>
+                <w:sz w:val="28"/>
+                <w:szCs w:val="32"/>
+              </w:rPr>
+            </w:pPr>
+            <w:r>
+              <w:rPr>
+                <w:rFonts w:cs="Arial"/>
+                <w:b/>
+                <w:sz w:val="28"/>
+                <w:szCs w:val="32"/>
+                <w:lang w:val="it-IT"/>
+              </w:rPr>
+              <w:t>Panchaati No</w:t>
+            </w:r>
+            <w:r>
+              <w:rPr>
+                <w:rFonts w:cs="Arial"/>
+                <w:b/>
+                <w:szCs w:val="32"/>
+                <w:lang w:val="it-IT"/>
+              </w:rPr>
+              <w:t>. -</w:t>
+            </w:r>
+            <w:r>
+              <w:rPr>
+                <w:rFonts w:cs="Arial"/>
+                <w:b/>
+                <w:sz w:val="28"/>
+                <w:szCs w:val="28"/>
+                <w:lang w:val="it-IT"/>
+              </w:rPr>
+              <w:t xml:space="preserve"> 6</w:t>
+            </w:r>
+          </w:p>
+        </w:tc>
+        <w:tc>
+          <w:tcPr>
+            <w:tcW w:w="5103" w:type="dxa"/>
+          </w:tcPr>
+          <w:p>
+            <w:pPr>
+              <w:widowControl w:val="0"/>
+              <w:autoSpaceDE w:val="0"/>
+              <w:autoSpaceDN w:val="0"/>
+              <w:adjustRightInd w:val="0"/>
+              <w:spacing w:before="0" w:line="240" w:lineRule="auto"/>
+              <w:rPr>
+                <w:rFonts w:ascii="BRH Malayalam Extra" w:eastAsia="Times New Roman" w:hAnsi="BRH Malayalam Extra" w:cs="BRH Malayalam Extra"/>
+                <w:color w:val="000000"/>
+                <w:sz w:val="40"/>
+                <w:szCs w:val="40"/>
+                <w:lang w:val="en-IN" w:eastAsia="en-IN" w:bidi="ml-IN"/>
+              </w:rPr>
+            </w:pPr>
+            <w:r>
+              <w:rPr>
+                <w:rFonts w:ascii="BRH Malayalam Extra" w:eastAsia="Times New Roman" w:hAnsi="BRH Malayalam Extra" w:cs="BRH Malayalam Extra"/>
+                <w:color w:val="000000"/>
+                <w:sz w:val="40"/>
+                <w:szCs w:val="40"/>
+                <w:lang w:val="en-IN" w:eastAsia="en-IN" w:bidi="ml-IN"/>
+              </w:rPr>
+              <w:t>h</w:t>
+            </w:r>
+            <w:r>
+              <w:rPr>
+                <w:rFonts w:ascii="BRH Malayalam Extra" w:eastAsia="Times New Roman" w:hAnsi="BRH Malayalam Extra" w:cs="BRH Malayalam Extra"/>
+                <w:color w:val="000000"/>
+                <w:sz w:val="32"/>
+                <w:szCs w:val="40"/>
+                <w:lang w:val="en-IN" w:eastAsia="en-IN" w:bidi="ml-IN"/>
+              </w:rPr>
+              <w:t>–</w:t>
+            </w:r>
+            <w:r>
+              <w:rPr>
+                <w:rFonts w:ascii="BRH Malayalam Extra" w:eastAsia="Times New Roman" w:hAnsi="BRH Malayalam Extra" w:cs="BRH Malayalam Extra"/>
+                <w:color w:val="000000"/>
+                <w:sz w:val="40"/>
+                <w:szCs w:val="40"/>
+                <w:lang w:val="en-IN" w:eastAsia="en-IN" w:bidi="ml-IN"/>
+              </w:rPr>
+              <w:t>p</w:t>
+            </w:r>
+            <w:r>
+              <w:rPr>
+                <w:rFonts w:ascii="BRH Malayalam Extra" w:eastAsia="Times New Roman" w:hAnsi="BRH Malayalam Extra" w:cs="BRH Malayalam Extra"/>
+                <w:color w:val="000000"/>
+                <w:sz w:val="32"/>
+                <w:szCs w:val="40"/>
+                <w:lang w:val="en-IN" w:eastAsia="en-IN" w:bidi="ml-IN"/>
+              </w:rPr>
+              <w:t>–</w:t>
+            </w:r>
+            <w:r>
+              <w:rPr>
+                <w:rFonts w:ascii="BRH Malayalam Extra" w:eastAsia="Times New Roman" w:hAnsi="BRH Malayalam Extra" w:cs="BRH Malayalam Extra"/>
+                <w:color w:val="000000"/>
+                <w:sz w:val="40"/>
+                <w:szCs w:val="40"/>
+                <w:lang w:val="en-IN" w:eastAsia="en-IN" w:bidi="ml-IN"/>
+              </w:rPr>
+              <w:t>Zy</w:t>
+            </w:r>
+            <w:r>
+              <w:rPr>
+                <w:rFonts w:ascii="BRH Malayalam Extra" w:eastAsia="Times New Roman" w:hAnsi="BRH Malayalam Extra" w:cs="BRH Malayalam Extra"/>
+                <w:color w:val="000000"/>
+                <w:sz w:val="32"/>
+                <w:szCs w:val="40"/>
+                <w:lang w:val="en-IN" w:eastAsia="en-IN" w:bidi="ml-IN"/>
+              </w:rPr>
+              <w:t>–</w:t>
+            </w:r>
+            <w:r>
+              <w:rPr>
+                <w:rFonts w:ascii="BRH Malayalam Extra" w:eastAsia="Times New Roman" w:hAnsi="BRH Malayalam Extra" w:cs="BRH Malayalam Extra"/>
+                <w:color w:val="000000"/>
+                <w:sz w:val="40"/>
+                <w:szCs w:val="40"/>
+                <w:lang w:val="en-IN" w:eastAsia="en-IN" w:bidi="ml-IN"/>
+              </w:rPr>
+              <w:t xml:space="preserve"> s</w:t>
+            </w:r>
+            <w:r>
+              <w:rPr>
+                <w:rFonts w:ascii="BRH Malayalam Extra" w:eastAsia="Times New Roman" w:hAnsi="BRH Malayalam Extra" w:cs="BRH Malayalam Extra"/>
+                <w:color w:val="000000"/>
+                <w:sz w:val="32"/>
+                <w:szCs w:val="40"/>
+                <w:highlight w:val="yellow"/>
+                <w:lang w:val="en-IN" w:eastAsia="en-IN" w:bidi="ml-IN"/>
+              </w:rPr>
+              <w:t>–</w:t>
+            </w:r>
+            <w:r>
+              <w:rPr>
+                <w:rFonts w:ascii="BRH Malayalam Extra" w:eastAsia="Times New Roman" w:hAnsi="BRH Malayalam Extra" w:cs="BRH Malayalam Extra"/>
+                <w:color w:val="000000"/>
+                <w:sz w:val="40"/>
+                <w:szCs w:val="40"/>
+                <w:highlight w:val="yellow"/>
+                <w:lang w:val="en-IN" w:eastAsia="en-IN" w:bidi="ml-IN"/>
+              </w:rPr>
+              <w:t>Z</w:t>
+            </w:r>
+            <w:r>
+              <w:rPr>
+                <w:rFonts w:ascii="BRH Malayalam Extra" w:eastAsia="Times New Roman" w:hAnsi="BRH Malayalam Extra" w:cs="BRH Malayalam Extra"/>
+                <w:color w:val="000000"/>
+                <w:sz w:val="40"/>
+                <w:szCs w:val="40"/>
+                <w:lang w:val="en-IN" w:eastAsia="en-IN" w:bidi="ml-IN"/>
+              </w:rPr>
+              <w:t>ûI | s</w:t>
+            </w:r>
+            <w:r>
+              <w:rPr>
+                <w:rFonts w:ascii="BRH Malayalam Extra" w:eastAsia="Times New Roman" w:hAnsi="BRH Malayalam Extra" w:cs="BRH Malayalam Extra"/>
+                <w:color w:val="000000"/>
+                <w:sz w:val="32"/>
+                <w:szCs w:val="40"/>
+                <w:lang w:val="en-IN" w:eastAsia="en-IN" w:bidi="ml-IN"/>
+              </w:rPr>
+              <w:t>–</w:t>
+            </w:r>
+            <w:r>
+              <w:rPr>
+                <w:rFonts w:ascii="BRH Malayalam Extra" w:eastAsia="Times New Roman" w:hAnsi="BRH Malayalam Extra" w:cs="BRH Malayalam Extra"/>
+                <w:color w:val="000000"/>
+                <w:sz w:val="40"/>
+                <w:szCs w:val="40"/>
+                <w:highlight w:val="yellow"/>
+                <w:lang w:val="en-IN" w:eastAsia="en-IN" w:bidi="ml-IN"/>
+              </w:rPr>
+              <w:t>Z</w:t>
+            </w:r>
+            <w:r>
+              <w:rPr>
+                <w:rFonts w:ascii="BRH Malayalam Extra" w:eastAsia="Times New Roman" w:hAnsi="BRH Malayalam Extra" w:cs="BRH Malayalam Extra"/>
+                <w:color w:val="000000"/>
+                <w:sz w:val="40"/>
+                <w:szCs w:val="40"/>
+                <w:lang w:val="en-IN" w:eastAsia="en-IN" w:bidi="ml-IN"/>
+              </w:rPr>
+              <w:t>û¥i</w:t>
+            </w:r>
+            <w:r>
+              <w:rPr>
+                <w:rFonts w:ascii="BRH Malayalam Extra" w:eastAsia="Times New Roman" w:hAnsi="BRH Malayalam Extra" w:cs="BRH Malayalam Extra"/>
+                <w:color w:val="000000"/>
+                <w:sz w:val="32"/>
+                <w:szCs w:val="40"/>
+                <w:lang w:val="en-IN" w:eastAsia="en-IN" w:bidi="ml-IN"/>
+              </w:rPr>
+              <w:t>–</w:t>
+            </w:r>
+            <w:r>
+              <w:rPr>
+                <w:rFonts w:ascii="BRH Malayalam Extra" w:eastAsia="Times New Roman" w:hAnsi="BRH Malayalam Extra" w:cs="BRH Malayalam Extra"/>
+                <w:color w:val="000000"/>
+                <w:sz w:val="40"/>
+                <w:szCs w:val="40"/>
+                <w:lang w:val="en-IN" w:eastAsia="en-IN" w:bidi="ml-IN"/>
+              </w:rPr>
+              <w:t xml:space="preserve">p | </w:t>
+            </w:r>
+          </w:p>
+          <w:p>
+            <w:pPr>
+              <w:widowControl w:val="0"/>
+              <w:autoSpaceDE w:val="0"/>
+              <w:autoSpaceDN w:val="0"/>
+              <w:adjustRightInd w:val="0"/>
+              <w:spacing w:before="0" w:line="240" w:lineRule="auto"/>
+              <w:rPr>
+                <w:rFonts w:ascii="BRH Devanagari Extra" w:hAnsi="BRH Devanagari Extra" w:cs="BRH Devanagari Extra"/>
+                <w:color w:val="000000"/>
+                <w:sz w:val="40"/>
+                <w:szCs w:val="40"/>
+                <w:lang w:val="en-IN"/>
+              </w:rPr>
+            </w:pPr>
+            <w:r>
+              <w:rPr>
+                <w:rFonts w:ascii="BRH Malayalam Extra" w:eastAsia="Times New Roman" w:hAnsi="BRH Malayalam Extra" w:cs="BRH Malayalam Extra"/>
+                <w:color w:val="000000"/>
+                <w:sz w:val="40"/>
+                <w:szCs w:val="40"/>
+                <w:lang w:val="en-IN" w:eastAsia="en-IN" w:bidi="ml-IN"/>
+              </w:rPr>
+              <w:t>s</w:t>
+            </w:r>
+            <w:r>
+              <w:rPr>
+                <w:rFonts w:ascii="BRH Malayalam Extra" w:eastAsia="Times New Roman" w:hAnsi="BRH Malayalam Extra" w:cs="BRH Malayalam Extra"/>
+                <w:color w:val="000000"/>
+                <w:sz w:val="32"/>
+                <w:szCs w:val="40"/>
+                <w:lang w:val="en-IN" w:eastAsia="en-IN" w:bidi="ml-IN"/>
+              </w:rPr>
+              <w:t>–</w:t>
+            </w:r>
+            <w:r>
+              <w:rPr>
+                <w:rFonts w:ascii="BRH Malayalam Extra" w:eastAsia="Times New Roman" w:hAnsi="BRH Malayalam Extra" w:cs="BRH Malayalam Extra"/>
+                <w:color w:val="000000"/>
+                <w:sz w:val="40"/>
+                <w:szCs w:val="40"/>
+                <w:highlight w:val="yellow"/>
+                <w:lang w:val="en-IN" w:eastAsia="en-IN" w:bidi="ml-IN"/>
+              </w:rPr>
+              <w:t>Z</w:t>
+            </w:r>
+            <w:r>
+              <w:rPr>
+                <w:rFonts w:ascii="BRH Malayalam Extra" w:eastAsia="Times New Roman" w:hAnsi="BRH Malayalam Extra" w:cs="BRH Malayalam Extra"/>
+                <w:color w:val="000000"/>
+                <w:sz w:val="40"/>
+                <w:szCs w:val="40"/>
+                <w:lang w:val="en-IN" w:eastAsia="en-IN" w:bidi="ml-IN"/>
+              </w:rPr>
+              <w:t xml:space="preserve">ûiyZy— sZ§ - ZûI | </w:t>
+            </w:r>
+          </w:p>
+        </w:tc>
+        <w:tc>
+          <w:tcPr>
+            <w:tcW w:w="5386" w:type="dxa"/>
+          </w:tcPr>
+          <w:p>
+            <w:pPr>
+              <w:widowControl w:val="0"/>
+              <w:autoSpaceDE w:val="0"/>
+              <w:autoSpaceDN w:val="0"/>
+              <w:adjustRightInd w:val="0"/>
+              <w:spacing w:before="0" w:line="240" w:lineRule="auto"/>
+              <w:rPr>
+                <w:rFonts w:ascii="BRH Devanagari Extra" w:hAnsi="BRH Devanagari Extra" w:cs="BRH Devanagari Extra"/>
+                <w:color w:val="000000"/>
+                <w:sz w:val="40"/>
+                <w:szCs w:val="40"/>
+              </w:rPr>
+            </w:pPr>
+            <w:r>
+              <w:rPr>
+                <w:rFonts w:ascii="BRH Malayalam Extra" w:eastAsia="Times New Roman" w:hAnsi="BRH Malayalam Extra" w:cs="BRH Malayalam Extra"/>
+                <w:color w:val="000000"/>
+                <w:sz w:val="40"/>
+                <w:szCs w:val="40"/>
+                <w:lang w:val="en-IN" w:eastAsia="en-IN" w:bidi="ml-IN"/>
+              </w:rPr>
+              <w:t>h</w:t>
+            </w:r>
+            <w:r>
+              <w:rPr>
+                <w:rFonts w:ascii="BRH Malayalam Extra" w:eastAsia="Times New Roman" w:hAnsi="BRH Malayalam Extra" w:cs="BRH Malayalam Extra"/>
+                <w:color w:val="000000"/>
+                <w:sz w:val="32"/>
+                <w:szCs w:val="40"/>
+                <w:lang w:val="en-IN" w:eastAsia="en-IN" w:bidi="ml-IN"/>
+              </w:rPr>
+              <w:t>–</w:t>
+            </w:r>
+            <w:r>
+              <w:rPr>
+                <w:rFonts w:ascii="BRH Malayalam Extra" w:eastAsia="Times New Roman" w:hAnsi="BRH Malayalam Extra" w:cs="BRH Malayalam Extra"/>
+                <w:color w:val="000000"/>
+                <w:sz w:val="40"/>
+                <w:szCs w:val="40"/>
+                <w:lang w:val="en-IN" w:eastAsia="en-IN" w:bidi="ml-IN"/>
+              </w:rPr>
+              <w:t>p</w:t>
+            </w:r>
+            <w:r>
+              <w:rPr>
+                <w:rFonts w:ascii="BRH Malayalam Extra" w:eastAsia="Times New Roman" w:hAnsi="BRH Malayalam Extra" w:cs="BRH Malayalam Extra"/>
+                <w:color w:val="000000"/>
+                <w:sz w:val="32"/>
+                <w:szCs w:val="40"/>
+                <w:lang w:val="en-IN" w:eastAsia="en-IN" w:bidi="ml-IN"/>
+              </w:rPr>
+              <w:t>–</w:t>
+            </w:r>
+            <w:r>
+              <w:rPr>
+                <w:rFonts w:ascii="BRH Malayalam Extra" w:eastAsia="Times New Roman" w:hAnsi="BRH Malayalam Extra" w:cs="BRH Malayalam Extra"/>
+                <w:color w:val="000000"/>
+                <w:sz w:val="40"/>
+                <w:szCs w:val="40"/>
+                <w:lang w:val="en-IN" w:eastAsia="en-IN" w:bidi="ml-IN"/>
+              </w:rPr>
+              <w:t>Zy</w:t>
+            </w:r>
+            <w:r>
+              <w:rPr>
+                <w:rFonts w:ascii="BRH Malayalam Extra" w:eastAsia="Times New Roman" w:hAnsi="BRH Malayalam Extra" w:cs="BRH Malayalam Extra"/>
+                <w:color w:val="000000"/>
+                <w:sz w:val="32"/>
+                <w:szCs w:val="40"/>
+                <w:lang w:val="en-IN" w:eastAsia="en-IN" w:bidi="ml-IN"/>
+              </w:rPr>
+              <w:t>–</w:t>
+            </w:r>
+            <w:r>
+              <w:rPr>
+                <w:rFonts w:ascii="BRH Malayalam Extra" w:eastAsia="Times New Roman" w:hAnsi="BRH Malayalam Extra" w:cs="BRH Malayalam Extra"/>
+                <w:color w:val="000000"/>
+                <w:sz w:val="40"/>
+                <w:szCs w:val="40"/>
+                <w:lang w:val="en-IN" w:eastAsia="en-IN" w:bidi="ml-IN"/>
+              </w:rPr>
+              <w:t xml:space="preserve"> s</w:t>
+            </w:r>
+            <w:r>
+              <w:rPr>
+                <w:rFonts w:ascii="BRH Malayalam Extra" w:eastAsia="Times New Roman" w:hAnsi="BRH Malayalam Extra" w:cs="BRH Malayalam Extra"/>
+                <w:color w:val="000000"/>
+                <w:sz w:val="32"/>
+                <w:szCs w:val="40"/>
+                <w:lang w:val="en-IN" w:eastAsia="en-IN" w:bidi="ml-IN"/>
+              </w:rPr>
+              <w:t>–</w:t>
+            </w:r>
+            <w:r>
+              <w:rPr>
+                <w:rFonts w:ascii="BRH Malayalam Extra" w:hAnsi="BRH Malayalam Extra" w:cs="BRH Malayalam Extra"/>
+                <w:sz w:val="40"/>
+                <w:szCs w:val="40"/>
+                <w:highlight w:val="green"/>
+              </w:rPr>
+              <w:t>À</w:t>
+            </w:r>
+            <w:r>
+              <w:rPr>
+                <w:rFonts w:ascii="BRH Malayalam Extra" w:eastAsia="Times New Roman" w:hAnsi="BRH Malayalam Extra" w:cs="BRH Malayalam Extra"/>
+                <w:color w:val="000000"/>
+                <w:sz w:val="40"/>
+                <w:szCs w:val="40"/>
+                <w:lang w:val="en-IN" w:eastAsia="en-IN" w:bidi="ml-IN"/>
+              </w:rPr>
+              <w:t>ûI | s</w:t>
+            </w:r>
+            <w:r>
+              <w:rPr>
+                <w:rFonts w:ascii="BRH Malayalam Extra" w:eastAsia="Times New Roman" w:hAnsi="BRH Malayalam Extra" w:cs="BRH Malayalam Extra"/>
+                <w:color w:val="000000"/>
+                <w:sz w:val="32"/>
+                <w:szCs w:val="40"/>
+                <w:lang w:val="en-IN" w:eastAsia="en-IN" w:bidi="ml-IN"/>
+              </w:rPr>
+              <w:t>–</w:t>
+            </w:r>
+            <w:r>
+              <w:rPr>
+                <w:rFonts w:ascii="BRH Malayalam Extra" w:hAnsi="BRH Malayalam Extra" w:cs="BRH Malayalam Extra"/>
+                <w:sz w:val="40"/>
+                <w:szCs w:val="40"/>
+                <w:highlight w:val="green"/>
+              </w:rPr>
+              <w:t>À</w:t>
+            </w:r>
+            <w:r>
+              <w:rPr>
+                <w:rFonts w:ascii="BRH Malayalam Extra" w:eastAsia="Times New Roman" w:hAnsi="BRH Malayalam Extra" w:cs="BRH Malayalam Extra"/>
+                <w:color w:val="000000"/>
+                <w:sz w:val="40"/>
+                <w:szCs w:val="40"/>
+                <w:lang w:val="en-IN" w:eastAsia="en-IN" w:bidi="ml-IN"/>
+              </w:rPr>
+              <w:t>û¥i</w:t>
+            </w:r>
+            <w:r>
+              <w:rPr>
+                <w:rFonts w:ascii="BRH Malayalam Extra" w:eastAsia="Times New Roman" w:hAnsi="BRH Malayalam Extra" w:cs="BRH Malayalam Extra"/>
+                <w:color w:val="000000"/>
+                <w:sz w:val="32"/>
+                <w:szCs w:val="40"/>
+                <w:lang w:val="en-IN" w:eastAsia="en-IN" w:bidi="ml-IN"/>
+              </w:rPr>
+              <w:t>–</w:t>
+            </w:r>
+            <w:r>
+              <w:rPr>
+                <w:rFonts w:ascii="BRH Malayalam Extra" w:eastAsia="Times New Roman" w:hAnsi="BRH Malayalam Extra" w:cs="BRH Malayalam Extra"/>
+                <w:color w:val="000000"/>
+                <w:sz w:val="40"/>
+                <w:szCs w:val="40"/>
+                <w:lang w:val="en-IN" w:eastAsia="en-IN" w:bidi="ml-IN"/>
+              </w:rPr>
+              <w:t>p | s</w:t>
+            </w:r>
+            <w:r>
+              <w:rPr>
+                <w:rFonts w:ascii="BRH Malayalam Extra" w:eastAsia="Times New Roman" w:hAnsi="BRH Malayalam Extra" w:cs="BRH Malayalam Extra"/>
+                <w:color w:val="000000"/>
+                <w:sz w:val="32"/>
+                <w:szCs w:val="40"/>
+                <w:lang w:val="en-IN" w:eastAsia="en-IN" w:bidi="ml-IN"/>
+              </w:rPr>
+              <w:t>–</w:t>
+            </w:r>
+            <w:r>
+              <w:rPr>
+                <w:rFonts w:ascii="BRH Malayalam Extra" w:hAnsi="BRH Malayalam Extra" w:cs="BRH Malayalam Extra"/>
+                <w:sz w:val="40"/>
+                <w:szCs w:val="40"/>
+                <w:highlight w:val="green"/>
+              </w:rPr>
+              <w:t>À</w:t>
+            </w:r>
+            <w:r>
+              <w:rPr>
+                <w:rFonts w:ascii="BRH Malayalam Extra" w:eastAsia="Times New Roman" w:hAnsi="BRH Malayalam Extra" w:cs="BRH Malayalam Extra"/>
+                <w:color w:val="000000"/>
+                <w:sz w:val="40"/>
+                <w:szCs w:val="40"/>
+                <w:lang w:val="en-IN" w:eastAsia="en-IN" w:bidi="ml-IN"/>
+              </w:rPr>
+              <w:t xml:space="preserve">ûiyZy— sZ§ - ZûI | </w:t>
+            </w:r>
+          </w:p>
+        </w:tc>
+      </w:tr>
+      <w:tr>
+        <w:trPr>
+          <w:trHeight w:val="1553"/>
+        </w:trPr>
+        <w:tc>
+          <w:tcPr>
+            <w:tcW w:w="3906" w:type="dxa"/>
+          </w:tcPr>
+          <w:p>
+            <w:pPr>
+              <w:widowControl w:val="0"/>
+              <w:tabs>
+                <w:tab w:val="left" w:pos="993"/>
+              </w:tabs>
+              <w:autoSpaceDE w:val="0"/>
+              <w:autoSpaceDN w:val="0"/>
+              <w:adjustRightInd w:val="0"/>
+              <w:spacing w:before="0" w:line="240" w:lineRule="auto"/>
+              <w:ind w:right="297"/>
+              <w:rPr>
+                <w:rFonts w:cs="Arial"/>
+                <w:b/>
+                <w:sz w:val="28"/>
+                <w:szCs w:val="32"/>
+              </w:rPr>
+            </w:pPr>
+            <w:r>
+              <w:rPr>
+                <w:rFonts w:cs="Arial"/>
+                <w:b/>
+                <w:sz w:val="28"/>
+                <w:szCs w:val="32"/>
+              </w:rPr>
+              <w:t>T.S.5.2.</w:t>
+            </w:r>
+            <w:r>
+              <w:rPr>
+                <w:rFonts w:cs="Arial"/>
+                <w:b/>
+                <w:sz w:val="28"/>
+                <w:szCs w:val="32"/>
+              </w:rPr>
+              <w:t>2.2</w:t>
+            </w:r>
+            <w:r>
+              <w:rPr>
+                <w:rFonts w:cs="Arial"/>
+                <w:b/>
+                <w:sz w:val="28"/>
+                <w:szCs w:val="32"/>
+              </w:rPr>
+              <w:t xml:space="preserve"> – Kramam</w:t>
+            </w:r>
+          </w:p>
+          <w:p>
+            <w:pPr>
+              <w:widowControl w:val="0"/>
+              <w:tabs>
+                <w:tab w:val="left" w:pos="993"/>
+              </w:tabs>
+              <w:autoSpaceDE w:val="0"/>
+              <w:autoSpaceDN w:val="0"/>
+              <w:adjustRightInd w:val="0"/>
+              <w:spacing w:before="0" w:line="240" w:lineRule="auto"/>
+              <w:ind w:right="297"/>
+              <w:rPr>
+                <w:rFonts w:cs="Arial"/>
+                <w:b/>
+                <w:sz w:val="28"/>
+                <w:szCs w:val="32"/>
+                <w:lang w:val="en-IN"/>
+              </w:rPr>
+            </w:pPr>
+            <w:r>
+              <w:rPr>
+                <w:rFonts w:cs="Arial"/>
+                <w:b/>
+                <w:sz w:val="28"/>
+                <w:szCs w:val="32"/>
+                <w:lang w:val="en-IN"/>
+              </w:rPr>
+              <w:t xml:space="preserve">Krama Vaakyam No.– </w:t>
+            </w:r>
+            <w:r>
+              <w:rPr>
+                <w:rFonts w:cs="Arial"/>
+                <w:b/>
+                <w:sz w:val="28"/>
+                <w:szCs w:val="32"/>
+                <w:lang w:val="en-IN"/>
+              </w:rPr>
+              <w:t>51,52,53</w:t>
+            </w:r>
+          </w:p>
+          <w:p>
+            <w:pPr>
+              <w:widowControl w:val="0"/>
+              <w:tabs>
+                <w:tab w:val="left" w:pos="993"/>
+              </w:tabs>
+              <w:autoSpaceDE w:val="0"/>
+              <w:autoSpaceDN w:val="0"/>
+              <w:adjustRightInd w:val="0"/>
+              <w:spacing w:before="0" w:line="240" w:lineRule="auto"/>
+              <w:ind w:right="297"/>
+              <w:rPr>
+                <w:rFonts w:cs="Arial"/>
+                <w:b/>
+                <w:sz w:val="28"/>
+                <w:szCs w:val="32"/>
+              </w:rPr>
+            </w:pPr>
+            <w:r>
+              <w:rPr>
+                <w:rFonts w:cs="Arial"/>
+                <w:b/>
+                <w:sz w:val="28"/>
+                <w:szCs w:val="32"/>
+                <w:lang w:val="it-IT"/>
+              </w:rPr>
+              <w:t>Panchaati No</w:t>
+            </w:r>
+            <w:r>
+              <w:rPr>
+                <w:rFonts w:cs="Arial"/>
+                <w:b/>
+                <w:szCs w:val="32"/>
+                <w:lang w:val="it-IT"/>
+              </w:rPr>
+              <w:t>. -</w:t>
+            </w:r>
+            <w:r>
+              <w:rPr>
+                <w:rFonts w:cs="Arial"/>
+                <w:b/>
+                <w:sz w:val="28"/>
+                <w:szCs w:val="28"/>
+                <w:lang w:val="it-IT"/>
+              </w:rPr>
+              <w:t xml:space="preserve"> </w:t>
+            </w:r>
+            <w:r>
+              <w:rPr>
+                <w:rFonts w:cs="Arial"/>
+                <w:b/>
+                <w:sz w:val="28"/>
+                <w:szCs w:val="28"/>
+                <w:lang w:val="it-IT"/>
+              </w:rPr>
+              <w:t>9</w:t>
+            </w:r>
+          </w:p>
+        </w:tc>
+        <w:tc>
+          <w:tcPr>
+            <w:tcW w:w="5103" w:type="dxa"/>
+          </w:tcPr>
+          <w:p>
+            <w:pPr>
+              <w:widowControl w:val="0"/>
+              <w:autoSpaceDE w:val="0"/>
+              <w:autoSpaceDN w:val="0"/>
+              <w:adjustRightInd w:val="0"/>
+              <w:spacing w:before="0" w:line="240" w:lineRule="auto"/>
+              <w:rPr>
+                <w:rFonts w:ascii="BRH Malayalam Extra" w:eastAsia="Times New Roman" w:hAnsi="BRH Malayalam Extra" w:cs="BRH Malayalam Extra"/>
+                <w:color w:val="000000"/>
+                <w:sz w:val="40"/>
+                <w:szCs w:val="40"/>
+                <w:lang w:val="en-IN" w:eastAsia="en-IN" w:bidi="ml-IN"/>
+              </w:rPr>
+            </w:pPr>
+            <w:r>
+              <w:rPr>
+                <w:rFonts w:ascii="BRH Malayalam Extra" w:eastAsia="Times New Roman" w:hAnsi="BRH Malayalam Extra" w:cs="BRH Malayalam Extra"/>
+                <w:color w:val="000000"/>
+                <w:sz w:val="40"/>
+                <w:szCs w:val="40"/>
+                <w:lang w:val="en-IN" w:eastAsia="en-IN" w:bidi="ml-IN"/>
+              </w:rPr>
+              <w:t>h</w:t>
+            </w:r>
+            <w:r>
+              <w:rPr>
+                <w:rFonts w:ascii="BRH Malayalam Extra" w:eastAsia="Times New Roman" w:hAnsi="BRH Malayalam Extra" w:cs="BRH Malayalam Extra"/>
+                <w:color w:val="000000"/>
+                <w:sz w:val="32"/>
+                <w:szCs w:val="40"/>
+                <w:lang w:val="en-IN" w:eastAsia="en-IN" w:bidi="ml-IN"/>
+              </w:rPr>
+              <w:t>–</w:t>
+            </w:r>
+            <w:r>
+              <w:rPr>
+                <w:rFonts w:ascii="BRH Malayalam Extra" w:eastAsia="Times New Roman" w:hAnsi="BRH Malayalam Extra" w:cs="BRH Malayalam Extra"/>
+                <w:color w:val="000000"/>
+                <w:sz w:val="40"/>
+                <w:szCs w:val="40"/>
+                <w:lang w:val="en-IN" w:eastAsia="en-IN" w:bidi="ml-IN"/>
+              </w:rPr>
+              <w:t>p</w:t>
+            </w:r>
+            <w:r>
+              <w:rPr>
+                <w:rFonts w:ascii="BRH Malayalam Extra" w:eastAsia="Times New Roman" w:hAnsi="BRH Malayalam Extra" w:cs="BRH Malayalam Extra"/>
+                <w:color w:val="000000"/>
+                <w:sz w:val="32"/>
+                <w:szCs w:val="40"/>
+                <w:lang w:val="en-IN" w:eastAsia="en-IN" w:bidi="ml-IN"/>
+              </w:rPr>
+              <w:t>–</w:t>
+            </w:r>
+            <w:r>
+              <w:rPr>
+                <w:rFonts w:ascii="BRH Malayalam Extra" w:eastAsia="Times New Roman" w:hAnsi="BRH Malayalam Extra" w:cs="BRH Malayalam Extra"/>
+                <w:color w:val="000000"/>
+                <w:sz w:val="40"/>
+                <w:szCs w:val="40"/>
+                <w:lang w:val="en-IN" w:eastAsia="en-IN" w:bidi="ml-IN"/>
+              </w:rPr>
+              <w:t>Zy</w:t>
+            </w:r>
+            <w:r>
+              <w:rPr>
+                <w:rFonts w:ascii="BRH Malayalam Extra" w:eastAsia="Times New Roman" w:hAnsi="BRH Malayalam Extra" w:cs="BRH Malayalam Extra"/>
+                <w:color w:val="000000"/>
+                <w:sz w:val="32"/>
+                <w:szCs w:val="40"/>
+                <w:lang w:val="en-IN" w:eastAsia="en-IN" w:bidi="ml-IN"/>
+              </w:rPr>
+              <w:t>–</w:t>
+            </w:r>
+            <w:r>
+              <w:rPr>
+                <w:rFonts w:ascii="BRH Malayalam Extra" w:eastAsia="Times New Roman" w:hAnsi="BRH Malayalam Extra" w:cs="BRH Malayalam Extra"/>
+                <w:color w:val="000000"/>
+                <w:sz w:val="40"/>
+                <w:szCs w:val="40"/>
+                <w:lang w:val="en-IN" w:eastAsia="en-IN" w:bidi="ml-IN"/>
+              </w:rPr>
+              <w:t xml:space="preserve"> s</w:t>
+            </w:r>
+            <w:r>
+              <w:rPr>
+                <w:rFonts w:ascii="BRH Malayalam Extra" w:eastAsia="Times New Roman" w:hAnsi="BRH Malayalam Extra" w:cs="BRH Malayalam Extra"/>
+                <w:color w:val="000000"/>
+                <w:sz w:val="32"/>
+                <w:szCs w:val="40"/>
+                <w:highlight w:val="yellow"/>
+                <w:lang w:val="en-IN" w:eastAsia="en-IN" w:bidi="ml-IN"/>
+              </w:rPr>
+              <w:t>–</w:t>
+            </w:r>
+            <w:r>
+              <w:rPr>
+                <w:rFonts w:ascii="BRH Malayalam Extra" w:eastAsia="Times New Roman" w:hAnsi="BRH Malayalam Extra" w:cs="BRH Malayalam Extra"/>
+                <w:color w:val="000000"/>
+                <w:sz w:val="40"/>
+                <w:szCs w:val="40"/>
+                <w:highlight w:val="yellow"/>
+                <w:lang w:val="en-IN" w:eastAsia="en-IN" w:bidi="ml-IN"/>
+              </w:rPr>
+              <w:t>Z</w:t>
+            </w:r>
+            <w:r>
+              <w:rPr>
+                <w:rFonts w:ascii="BRH Malayalam Extra" w:eastAsia="Times New Roman" w:hAnsi="BRH Malayalam Extra" w:cs="BRH Malayalam Extra"/>
+                <w:color w:val="000000"/>
+                <w:sz w:val="40"/>
+                <w:szCs w:val="40"/>
+                <w:lang w:val="en-IN" w:eastAsia="en-IN" w:bidi="ml-IN"/>
+              </w:rPr>
+              <w:t>ûI | s</w:t>
+            </w:r>
+            <w:r>
+              <w:rPr>
+                <w:rFonts w:ascii="BRH Malayalam Extra" w:eastAsia="Times New Roman" w:hAnsi="BRH Malayalam Extra" w:cs="BRH Malayalam Extra"/>
+                <w:color w:val="000000"/>
+                <w:sz w:val="32"/>
+                <w:szCs w:val="40"/>
+                <w:lang w:val="en-IN" w:eastAsia="en-IN" w:bidi="ml-IN"/>
+              </w:rPr>
+              <w:t>–</w:t>
+            </w:r>
+            <w:r>
+              <w:rPr>
+                <w:rFonts w:ascii="BRH Malayalam Extra" w:eastAsia="Times New Roman" w:hAnsi="BRH Malayalam Extra" w:cs="BRH Malayalam Extra"/>
+                <w:color w:val="000000"/>
+                <w:sz w:val="40"/>
+                <w:szCs w:val="40"/>
+                <w:highlight w:val="yellow"/>
+                <w:lang w:val="en-IN" w:eastAsia="en-IN" w:bidi="ml-IN"/>
+              </w:rPr>
+              <w:t>Z</w:t>
+            </w:r>
+            <w:r>
+              <w:rPr>
+                <w:rFonts w:ascii="BRH Malayalam Extra" w:eastAsia="Times New Roman" w:hAnsi="BRH Malayalam Extra" w:cs="BRH Malayalam Extra"/>
+                <w:color w:val="000000"/>
+                <w:sz w:val="40"/>
+                <w:szCs w:val="40"/>
+                <w:lang w:val="en-IN" w:eastAsia="en-IN" w:bidi="ml-IN"/>
+              </w:rPr>
+              <w:t>û¥i</w:t>
+            </w:r>
+            <w:r>
+              <w:rPr>
+                <w:rFonts w:ascii="BRH Malayalam Extra" w:eastAsia="Times New Roman" w:hAnsi="BRH Malayalam Extra" w:cs="BRH Malayalam Extra"/>
+                <w:color w:val="000000"/>
+                <w:sz w:val="32"/>
+                <w:szCs w:val="40"/>
+                <w:lang w:val="en-IN" w:eastAsia="en-IN" w:bidi="ml-IN"/>
+              </w:rPr>
+              <w:t>–</w:t>
+            </w:r>
+            <w:r>
+              <w:rPr>
+                <w:rFonts w:ascii="BRH Malayalam Extra" w:eastAsia="Times New Roman" w:hAnsi="BRH Malayalam Extra" w:cs="BRH Malayalam Extra"/>
+                <w:color w:val="000000"/>
+                <w:sz w:val="40"/>
+                <w:szCs w:val="40"/>
+                <w:lang w:val="en-IN" w:eastAsia="en-IN" w:bidi="ml-IN"/>
+              </w:rPr>
+              <w:t xml:space="preserve">p | </w:t>
+            </w:r>
+          </w:p>
+          <w:p>
+            <w:pPr>
+              <w:widowControl w:val="0"/>
+              <w:autoSpaceDE w:val="0"/>
+              <w:autoSpaceDN w:val="0"/>
+              <w:adjustRightInd w:val="0"/>
+              <w:spacing w:before="0" w:line="240" w:lineRule="auto"/>
+              <w:rPr>
+                <w:rFonts w:ascii="BRH Devanagari Extra" w:hAnsi="BRH Devanagari Extra" w:cs="BRH Devanagari Extra"/>
+                <w:color w:val="000000"/>
+                <w:sz w:val="40"/>
+                <w:szCs w:val="40"/>
+              </w:rPr>
+            </w:pPr>
+            <w:r>
+              <w:rPr>
+                <w:rFonts w:ascii="BRH Malayalam Extra" w:eastAsia="Times New Roman" w:hAnsi="BRH Malayalam Extra" w:cs="BRH Malayalam Extra"/>
+                <w:color w:val="000000"/>
+                <w:sz w:val="40"/>
+                <w:szCs w:val="40"/>
+                <w:lang w:val="en-IN" w:eastAsia="en-IN" w:bidi="ml-IN"/>
+              </w:rPr>
+              <w:t>s</w:t>
+            </w:r>
+            <w:r>
+              <w:rPr>
+                <w:rFonts w:ascii="BRH Malayalam Extra" w:eastAsia="Times New Roman" w:hAnsi="BRH Malayalam Extra" w:cs="BRH Malayalam Extra"/>
+                <w:color w:val="000000"/>
+                <w:sz w:val="32"/>
+                <w:szCs w:val="40"/>
+                <w:lang w:val="en-IN" w:eastAsia="en-IN" w:bidi="ml-IN"/>
+              </w:rPr>
+              <w:t>–</w:t>
+            </w:r>
+            <w:r>
+              <w:rPr>
+                <w:rFonts w:ascii="BRH Malayalam Extra" w:eastAsia="Times New Roman" w:hAnsi="BRH Malayalam Extra" w:cs="BRH Malayalam Extra"/>
+                <w:color w:val="000000"/>
+                <w:sz w:val="40"/>
+                <w:szCs w:val="40"/>
+                <w:highlight w:val="yellow"/>
+                <w:lang w:val="en-IN" w:eastAsia="en-IN" w:bidi="ml-IN"/>
+              </w:rPr>
+              <w:t>Z</w:t>
+            </w:r>
+            <w:r>
+              <w:rPr>
+                <w:rFonts w:ascii="BRH Malayalam Extra" w:eastAsia="Times New Roman" w:hAnsi="BRH Malayalam Extra" w:cs="BRH Malayalam Extra"/>
+                <w:color w:val="000000"/>
+                <w:sz w:val="40"/>
+                <w:szCs w:val="40"/>
+                <w:lang w:val="en-IN" w:eastAsia="en-IN" w:bidi="ml-IN"/>
+              </w:rPr>
+              <w:t>ûiyZy— sZ§ - ZûI |</w:t>
+            </w:r>
+          </w:p>
+        </w:tc>
+        <w:tc>
+          <w:tcPr>
+            <w:tcW w:w="5386" w:type="dxa"/>
+          </w:tcPr>
+          <w:p>
+            <w:pPr>
+              <w:widowControl w:val="0"/>
+              <w:autoSpaceDE w:val="0"/>
+              <w:autoSpaceDN w:val="0"/>
+              <w:adjustRightInd w:val="0"/>
+              <w:spacing w:before="0" w:line="240" w:lineRule="auto"/>
+              <w:rPr>
+                <w:rFonts w:ascii="BRH Devanagari Extra" w:hAnsi="BRH Devanagari Extra" w:cs="BRH Devanagari Extra"/>
+                <w:sz w:val="40"/>
+                <w:szCs w:val="40"/>
+              </w:rPr>
+            </w:pPr>
+            <w:r>
+              <w:rPr>
+                <w:rFonts w:ascii="BRH Malayalam Extra" w:eastAsia="Times New Roman" w:hAnsi="BRH Malayalam Extra" w:cs="BRH Malayalam Extra"/>
+                <w:color w:val="000000"/>
+                <w:sz w:val="40"/>
+                <w:szCs w:val="40"/>
+                <w:lang w:val="en-IN" w:eastAsia="en-IN" w:bidi="ml-IN"/>
+              </w:rPr>
+              <w:t>h</w:t>
+            </w:r>
+            <w:r>
+              <w:rPr>
+                <w:rFonts w:ascii="BRH Malayalam Extra" w:eastAsia="Times New Roman" w:hAnsi="BRH Malayalam Extra" w:cs="BRH Malayalam Extra"/>
+                <w:color w:val="000000"/>
+                <w:sz w:val="32"/>
+                <w:szCs w:val="40"/>
+                <w:lang w:val="en-IN" w:eastAsia="en-IN" w:bidi="ml-IN"/>
+              </w:rPr>
+              <w:t>–</w:t>
+            </w:r>
+            <w:r>
+              <w:rPr>
+                <w:rFonts w:ascii="BRH Malayalam Extra" w:eastAsia="Times New Roman" w:hAnsi="BRH Malayalam Extra" w:cs="BRH Malayalam Extra"/>
+                <w:color w:val="000000"/>
+                <w:sz w:val="40"/>
+                <w:szCs w:val="40"/>
+                <w:lang w:val="en-IN" w:eastAsia="en-IN" w:bidi="ml-IN"/>
+              </w:rPr>
+              <w:t>p</w:t>
+            </w:r>
+            <w:r>
+              <w:rPr>
+                <w:rFonts w:ascii="BRH Malayalam Extra" w:eastAsia="Times New Roman" w:hAnsi="BRH Malayalam Extra" w:cs="BRH Malayalam Extra"/>
+                <w:color w:val="000000"/>
+                <w:sz w:val="32"/>
+                <w:szCs w:val="40"/>
+                <w:lang w:val="en-IN" w:eastAsia="en-IN" w:bidi="ml-IN"/>
+              </w:rPr>
+              <w:t>–</w:t>
+            </w:r>
+            <w:r>
+              <w:rPr>
+                <w:rFonts w:ascii="BRH Malayalam Extra" w:eastAsia="Times New Roman" w:hAnsi="BRH Malayalam Extra" w:cs="BRH Malayalam Extra"/>
+                <w:color w:val="000000"/>
+                <w:sz w:val="40"/>
+                <w:szCs w:val="40"/>
+                <w:lang w:val="en-IN" w:eastAsia="en-IN" w:bidi="ml-IN"/>
+              </w:rPr>
+              <w:t>Zy</w:t>
+            </w:r>
+            <w:r>
+              <w:rPr>
+                <w:rFonts w:ascii="BRH Malayalam Extra" w:eastAsia="Times New Roman" w:hAnsi="BRH Malayalam Extra" w:cs="BRH Malayalam Extra"/>
+                <w:color w:val="000000"/>
+                <w:sz w:val="32"/>
+                <w:szCs w:val="40"/>
+                <w:lang w:val="en-IN" w:eastAsia="en-IN" w:bidi="ml-IN"/>
+              </w:rPr>
+              <w:t>–</w:t>
+            </w:r>
+            <w:r>
+              <w:rPr>
+                <w:rFonts w:ascii="BRH Malayalam Extra" w:eastAsia="Times New Roman" w:hAnsi="BRH Malayalam Extra" w:cs="BRH Malayalam Extra"/>
+                <w:color w:val="000000"/>
+                <w:sz w:val="40"/>
+                <w:szCs w:val="40"/>
+                <w:lang w:val="en-IN" w:eastAsia="en-IN" w:bidi="ml-IN"/>
+              </w:rPr>
+              <w:t xml:space="preserve"> s</w:t>
+            </w:r>
+            <w:r>
+              <w:rPr>
+                <w:rFonts w:ascii="BRH Malayalam Extra" w:eastAsia="Times New Roman" w:hAnsi="BRH Malayalam Extra" w:cs="BRH Malayalam Extra"/>
+                <w:color w:val="000000"/>
+                <w:sz w:val="32"/>
+                <w:szCs w:val="40"/>
+                <w:lang w:val="en-IN" w:eastAsia="en-IN" w:bidi="ml-IN"/>
+              </w:rPr>
+              <w:t>–</w:t>
+            </w:r>
+            <w:r>
+              <w:rPr>
+                <w:rFonts w:ascii="BRH Malayalam Extra" w:hAnsi="BRH Malayalam Extra" w:cs="BRH Malayalam Extra"/>
+                <w:sz w:val="40"/>
+                <w:szCs w:val="40"/>
+                <w:highlight w:val="green"/>
+              </w:rPr>
+              <w:t>À</w:t>
+            </w:r>
+            <w:r>
+              <w:rPr>
+                <w:rFonts w:ascii="BRH Malayalam Extra" w:eastAsia="Times New Roman" w:hAnsi="BRH Malayalam Extra" w:cs="BRH Malayalam Extra"/>
+                <w:color w:val="000000"/>
+                <w:sz w:val="40"/>
+                <w:szCs w:val="40"/>
+                <w:lang w:val="en-IN" w:eastAsia="en-IN" w:bidi="ml-IN"/>
+              </w:rPr>
+              <w:t>ûI | s</w:t>
+            </w:r>
+            <w:r>
+              <w:rPr>
+                <w:rFonts w:ascii="BRH Malayalam Extra" w:eastAsia="Times New Roman" w:hAnsi="BRH Malayalam Extra" w:cs="BRH Malayalam Extra"/>
+                <w:color w:val="000000"/>
+                <w:sz w:val="32"/>
+                <w:szCs w:val="40"/>
+                <w:lang w:val="en-IN" w:eastAsia="en-IN" w:bidi="ml-IN"/>
+              </w:rPr>
+              <w:t>–</w:t>
+            </w:r>
+            <w:r>
+              <w:rPr>
+                <w:rFonts w:ascii="BRH Malayalam Extra" w:hAnsi="BRH Malayalam Extra" w:cs="BRH Malayalam Extra"/>
+                <w:sz w:val="40"/>
+                <w:szCs w:val="40"/>
+                <w:highlight w:val="green"/>
+              </w:rPr>
+              <w:t>À</w:t>
+            </w:r>
+            <w:r>
+              <w:rPr>
+                <w:rFonts w:ascii="BRH Malayalam Extra" w:eastAsia="Times New Roman" w:hAnsi="BRH Malayalam Extra" w:cs="BRH Malayalam Extra"/>
+                <w:color w:val="000000"/>
+                <w:sz w:val="40"/>
+                <w:szCs w:val="40"/>
+                <w:lang w:val="en-IN" w:eastAsia="en-IN" w:bidi="ml-IN"/>
+              </w:rPr>
+              <w:t>û¥i</w:t>
+            </w:r>
+            <w:r>
+              <w:rPr>
+                <w:rFonts w:ascii="BRH Malayalam Extra" w:eastAsia="Times New Roman" w:hAnsi="BRH Malayalam Extra" w:cs="BRH Malayalam Extra"/>
+                <w:color w:val="000000"/>
+                <w:sz w:val="32"/>
+                <w:szCs w:val="40"/>
+                <w:lang w:val="en-IN" w:eastAsia="en-IN" w:bidi="ml-IN"/>
+              </w:rPr>
+              <w:t>–</w:t>
+            </w:r>
+            <w:r>
+              <w:rPr>
+                <w:rFonts w:ascii="BRH Malayalam Extra" w:eastAsia="Times New Roman" w:hAnsi="BRH Malayalam Extra" w:cs="BRH Malayalam Extra"/>
+                <w:color w:val="000000"/>
+                <w:sz w:val="40"/>
+                <w:szCs w:val="40"/>
+                <w:lang w:val="en-IN" w:eastAsia="en-IN" w:bidi="ml-IN"/>
+              </w:rPr>
+              <w:t>p | s</w:t>
+            </w:r>
+            <w:r>
+              <w:rPr>
+                <w:rFonts w:ascii="BRH Malayalam Extra" w:eastAsia="Times New Roman" w:hAnsi="BRH Malayalam Extra" w:cs="BRH Malayalam Extra"/>
+                <w:color w:val="000000"/>
+                <w:sz w:val="32"/>
+                <w:szCs w:val="40"/>
+                <w:lang w:val="en-IN" w:eastAsia="en-IN" w:bidi="ml-IN"/>
+              </w:rPr>
+              <w:t>–</w:t>
+            </w:r>
+            <w:r>
+              <w:rPr>
+                <w:rFonts w:ascii="BRH Malayalam Extra" w:hAnsi="BRH Malayalam Extra" w:cs="BRH Malayalam Extra"/>
+                <w:sz w:val="40"/>
+                <w:szCs w:val="40"/>
+                <w:highlight w:val="green"/>
+              </w:rPr>
+              <w:t>À</w:t>
+            </w:r>
+            <w:r>
+              <w:rPr>
+                <w:rFonts w:ascii="BRH Malayalam Extra" w:eastAsia="Times New Roman" w:hAnsi="BRH Malayalam Extra" w:cs="BRH Malayalam Extra"/>
+                <w:color w:val="000000"/>
+                <w:sz w:val="40"/>
+                <w:szCs w:val="40"/>
+                <w:lang w:val="en-IN" w:eastAsia="en-IN" w:bidi="ml-IN"/>
+              </w:rPr>
+              <w:t>ûiyZy— sZ§ - ZûI |</w:t>
+            </w:r>
+          </w:p>
+        </w:tc>
+      </w:tr>
+      <w:tr>
+        <w:trPr>
           <w:trHeight w:val="1118"/>
         </w:trPr>
         <w:tc>
@@ -262,7 +1401,7 @@
               <w:autoSpaceDE w:val="0"/>
               <w:autoSpaceDN w:val="0"/>
               <w:adjustRightInd w:val="0"/>
-              <w:spacing w:before="0" w:line="252" w:lineRule="auto"/>
+              <w:spacing w:before="0" w:line="240" w:lineRule="auto"/>
               <w:ind w:right="297"/>
               <w:rPr>
                 <w:rFonts w:cs="Arial"/>
@@ -308,7 +1447,7 @@
               <w:autoSpaceDE w:val="0"/>
               <w:autoSpaceDN w:val="0"/>
               <w:adjustRightInd w:val="0"/>
-              <w:spacing w:before="0" w:line="252" w:lineRule="auto"/>
+              <w:spacing w:before="0" w:line="240" w:lineRule="auto"/>
               <w:ind w:right="297"/>
               <w:rPr>
                 <w:rFonts w:cs="Arial"/>
@@ -348,7 +1487,7 @@
               <w:autoSpaceDE w:val="0"/>
               <w:autoSpaceDN w:val="0"/>
               <w:adjustRightInd w:val="0"/>
-              <w:spacing w:before="0" w:line="252" w:lineRule="auto"/>
+              <w:spacing w:before="0" w:line="240" w:lineRule="auto"/>
               <w:ind w:right="297"/>
               <w:rPr>
                 <w:rFonts w:cs="Arial"/>
@@ -561,7 +1700,7 @@
               <w:autoSpaceDE w:val="0"/>
               <w:autoSpaceDN w:val="0"/>
               <w:adjustRightInd w:val="0"/>
-              <w:spacing w:before="0" w:line="252" w:lineRule="auto"/>
+              <w:spacing w:before="0" w:line="240" w:lineRule="auto"/>
               <w:ind w:right="297"/>
               <w:rPr>
                 <w:rFonts w:cs="Arial"/>
@@ -607,7 +1746,7 @@
               <w:autoSpaceDE w:val="0"/>
               <w:autoSpaceDN w:val="0"/>
               <w:adjustRightInd w:val="0"/>
-              <w:spacing w:before="0" w:line="252" w:lineRule="auto"/>
+              <w:spacing w:before="0" w:line="240" w:lineRule="auto"/>
               <w:ind w:right="297"/>
               <w:rPr>
                 <w:rFonts w:cs="Arial"/>
@@ -637,7 +1776,7 @@
               <w:autoSpaceDE w:val="0"/>
               <w:autoSpaceDN w:val="0"/>
               <w:adjustRightInd w:val="0"/>
-              <w:spacing w:before="0" w:line="252" w:lineRule="auto"/>
+              <w:spacing w:before="0" w:line="240" w:lineRule="auto"/>
               <w:ind w:right="297"/>
               <w:rPr>
                 <w:rFonts w:cs="Arial"/>
@@ -951,6 +2090,595 @@
                 <w:lang w:val="it-IT" w:eastAsia="en-IN" w:bidi="ml-IN"/>
               </w:rPr>
               <w:t>°I |</w:t>
+            </w:r>
+          </w:p>
+        </w:tc>
+      </w:tr>
+      <w:tr>
+        <w:trPr>
+          <w:trHeight w:val="1685"/>
+        </w:trPr>
+        <w:tc>
+          <w:tcPr>
+            <w:tcW w:w="3906" w:type="dxa"/>
+          </w:tcPr>
+          <w:p>
+            <w:pPr>
+              <w:widowControl w:val="0"/>
+              <w:tabs>
+                <w:tab w:val="left" w:pos="993"/>
+              </w:tabs>
+              <w:autoSpaceDE w:val="0"/>
+              <w:autoSpaceDN w:val="0"/>
+              <w:adjustRightInd w:val="0"/>
+              <w:spacing w:before="0" w:line="240" w:lineRule="auto"/>
+              <w:ind w:right="297"/>
+              <w:rPr>
+                <w:rFonts w:cs="Arial"/>
+                <w:b/>
+                <w:sz w:val="28"/>
+                <w:szCs w:val="32"/>
+              </w:rPr>
+            </w:pPr>
+            <w:r>
+              <w:rPr>
+                <w:rFonts w:cs="Arial"/>
+                <w:b/>
+                <w:sz w:val="28"/>
+                <w:szCs w:val="32"/>
+              </w:rPr>
+              <w:t>T.S.5.2.</w:t>
+            </w:r>
+            <w:r>
+              <w:rPr>
+                <w:rFonts w:cs="Arial"/>
+                <w:b/>
+                <w:sz w:val="28"/>
+                <w:szCs w:val="32"/>
+              </w:rPr>
+              <w:t>4.4</w:t>
+            </w:r>
+            <w:r>
+              <w:rPr>
+                <w:rFonts w:cs="Arial"/>
+                <w:b/>
+                <w:sz w:val="28"/>
+                <w:szCs w:val="32"/>
+              </w:rPr>
+              <w:t xml:space="preserve"> – Kramam</w:t>
+            </w:r>
+          </w:p>
+          <w:p>
+            <w:pPr>
+              <w:widowControl w:val="0"/>
+              <w:tabs>
+                <w:tab w:val="left" w:pos="993"/>
+              </w:tabs>
+              <w:autoSpaceDE w:val="0"/>
+              <w:autoSpaceDN w:val="0"/>
+              <w:adjustRightInd w:val="0"/>
+              <w:spacing w:before="0" w:line="240" w:lineRule="auto"/>
+              <w:ind w:right="297"/>
+              <w:rPr>
+                <w:rFonts w:cs="Arial"/>
+                <w:b/>
+                <w:sz w:val="28"/>
+                <w:szCs w:val="32"/>
+                <w:lang w:val="en-IN"/>
+              </w:rPr>
+            </w:pPr>
+            <w:r>
+              <w:rPr>
+                <w:rFonts w:cs="Arial"/>
+                <w:b/>
+                <w:sz w:val="28"/>
+                <w:szCs w:val="32"/>
+                <w:lang w:val="en-IN"/>
+              </w:rPr>
+              <w:t xml:space="preserve">Krama Vaakyam No.– </w:t>
+            </w:r>
+            <w:r>
+              <w:rPr>
+                <w:rFonts w:cs="Arial"/>
+                <w:b/>
+                <w:sz w:val="28"/>
+                <w:szCs w:val="32"/>
+                <w:lang w:val="en-IN"/>
+              </w:rPr>
+              <w:t>25</w:t>
+            </w:r>
+          </w:p>
+          <w:p>
+            <w:pPr>
+              <w:widowControl w:val="0"/>
+              <w:tabs>
+                <w:tab w:val="left" w:pos="993"/>
+              </w:tabs>
+              <w:autoSpaceDE w:val="0"/>
+              <w:autoSpaceDN w:val="0"/>
+              <w:adjustRightInd w:val="0"/>
+              <w:spacing w:before="0" w:line="240" w:lineRule="auto"/>
+              <w:ind w:right="297"/>
+              <w:rPr>
+                <w:rFonts w:cs="Arial"/>
+                <w:b/>
+                <w:sz w:val="28"/>
+                <w:szCs w:val="32"/>
+              </w:rPr>
+            </w:pPr>
+            <w:r>
+              <w:rPr>
+                <w:rFonts w:cs="Arial"/>
+                <w:b/>
+                <w:sz w:val="28"/>
+                <w:szCs w:val="32"/>
+                <w:lang w:val="it-IT"/>
+              </w:rPr>
+              <w:t>Panchaati No</w:t>
+            </w:r>
+            <w:r>
+              <w:rPr>
+                <w:rFonts w:cs="Arial"/>
+                <w:b/>
+                <w:szCs w:val="32"/>
+                <w:lang w:val="it-IT"/>
+              </w:rPr>
+              <w:t>. -</w:t>
+            </w:r>
+            <w:r>
+              <w:rPr>
+                <w:rFonts w:cs="Arial"/>
+                <w:b/>
+                <w:sz w:val="28"/>
+                <w:szCs w:val="28"/>
+                <w:lang w:val="it-IT"/>
+              </w:rPr>
+              <w:t xml:space="preserve"> 24</w:t>
+            </w:r>
+          </w:p>
+        </w:tc>
+        <w:tc>
+          <w:tcPr>
+            <w:tcW w:w="5103" w:type="dxa"/>
+          </w:tcPr>
+          <w:p>
+            <w:pPr>
+              <w:widowControl w:val="0"/>
+              <w:autoSpaceDE w:val="0"/>
+              <w:autoSpaceDN w:val="0"/>
+              <w:adjustRightInd w:val="0"/>
+              <w:spacing w:before="0" w:line="240" w:lineRule="auto"/>
+              <w:rPr>
+                <w:rFonts w:ascii="BRH Malayalam Extra" w:eastAsia="Times New Roman" w:hAnsi="BRH Malayalam Extra" w:cs="BRH Malayalam Extra"/>
+                <w:color w:val="000000"/>
+                <w:sz w:val="40"/>
+                <w:szCs w:val="40"/>
+                <w:lang w:val="en-IN" w:eastAsia="en-IN" w:bidi="ml-IN"/>
+              </w:rPr>
+            </w:pPr>
+            <w:r>
+              <w:rPr>
+                <w:rFonts w:ascii="BRH Malayalam Extra" w:eastAsia="Times New Roman" w:hAnsi="BRH Malayalam Extra" w:cs="BRH Malayalam Extra"/>
+                <w:color w:val="000000"/>
+                <w:sz w:val="40"/>
+                <w:szCs w:val="40"/>
+                <w:lang w:val="en-IN" w:eastAsia="en-IN" w:bidi="ml-IN"/>
+              </w:rPr>
+              <w:t xml:space="preserve">De— Zyrç¥Ç | </w:t>
+            </w:r>
+          </w:p>
+          <w:p>
+            <w:pPr>
+              <w:widowControl w:val="0"/>
+              <w:autoSpaceDE w:val="0"/>
+              <w:autoSpaceDN w:val="0"/>
+              <w:adjustRightInd w:val="0"/>
+              <w:spacing w:before="0" w:line="240" w:lineRule="auto"/>
+              <w:rPr>
+                <w:rFonts w:ascii="BRH Devanagari Extra" w:hAnsi="BRH Devanagari Extra" w:cs="BRH Devanagari Extra"/>
+                <w:color w:val="000000"/>
+                <w:sz w:val="40"/>
+                <w:szCs w:val="40"/>
+              </w:rPr>
+            </w:pPr>
+            <w:r>
+              <w:rPr>
+                <w:rFonts w:ascii="BRH Malayalam Extra" w:eastAsia="Times New Roman" w:hAnsi="BRH Malayalam Extra" w:cs="BRH Malayalam Extra"/>
+                <w:color w:val="000000"/>
+                <w:sz w:val="40"/>
+                <w:szCs w:val="40"/>
+                <w:lang w:eastAsia="en-IN" w:bidi="ml-IN"/>
+              </w:rPr>
+              <w:t>Zy</w:t>
+            </w:r>
+            <w:r>
+              <w:rPr>
+                <w:rFonts w:ascii="BRH Malayalam Extra" w:eastAsia="Times New Roman" w:hAnsi="BRH Malayalam Extra" w:cs="BRH Malayalam Extra"/>
+                <w:color w:val="000000"/>
+                <w:sz w:val="32"/>
+                <w:szCs w:val="40"/>
+                <w:lang w:eastAsia="en-IN" w:bidi="ml-IN"/>
+              </w:rPr>
+              <w:t>–</w:t>
+            </w:r>
+            <w:r>
+              <w:rPr>
+                <w:rFonts w:ascii="BRH Malayalam Extra" w:eastAsia="Times New Roman" w:hAnsi="BRH Malayalam Extra" w:cs="BRH Malayalam Extra"/>
+                <w:color w:val="000000"/>
+                <w:sz w:val="40"/>
+                <w:szCs w:val="40"/>
+                <w:highlight w:val="yellow"/>
+                <w:lang w:eastAsia="en-IN" w:bidi="ml-IN"/>
+              </w:rPr>
+              <w:t>r</w:t>
+            </w:r>
+            <w:r>
+              <w:rPr>
+                <w:rFonts w:ascii="BRH Malayalam Extra" w:eastAsia="Times New Roman" w:hAnsi="BRH Malayalam Extra" w:cs="BRH Malayalam Extra"/>
+                <w:color w:val="000000"/>
+                <w:sz w:val="32"/>
+                <w:szCs w:val="40"/>
+                <w:highlight w:val="yellow"/>
+                <w:lang w:eastAsia="en-IN" w:bidi="ml-IN"/>
+              </w:rPr>
+              <w:t>–</w:t>
+            </w:r>
+            <w:r>
+              <w:rPr>
+                <w:rFonts w:ascii="BRH Malayalam Extra" w:eastAsia="Times New Roman" w:hAnsi="BRH Malayalam Extra" w:cs="BRH Malayalam Extra"/>
+                <w:color w:val="000000"/>
+                <w:sz w:val="40"/>
+                <w:szCs w:val="40"/>
+                <w:lang w:eastAsia="en-IN" w:bidi="ml-IN"/>
+              </w:rPr>
+              <w:t>¥Ç</w:t>
+            </w:r>
+            <w:r>
+              <w:rPr>
+                <w:rFonts w:ascii="BRH Malayalam Extra" w:eastAsia="Times New Roman" w:hAnsi="BRH Malayalam Extra" w:cs="BRH Malayalam Extra"/>
+                <w:color w:val="000000"/>
+                <w:sz w:val="32"/>
+                <w:szCs w:val="40"/>
+                <w:lang w:eastAsia="en-IN" w:bidi="ml-IN"/>
+              </w:rPr>
+              <w:t>–</w:t>
+            </w:r>
+            <w:r>
+              <w:rPr>
+                <w:rFonts w:ascii="BRH Malayalam Extra" w:eastAsia="Times New Roman" w:hAnsi="BRH Malayalam Extra" w:cs="BRH Malayalam Extra"/>
+                <w:color w:val="000000"/>
+                <w:sz w:val="40"/>
+                <w:szCs w:val="40"/>
+                <w:lang w:eastAsia="en-IN" w:bidi="ml-IN"/>
+              </w:rPr>
+              <w:t xml:space="preserve"> dy</w:t>
+            </w:r>
+            <w:r>
+              <w:rPr>
+                <w:rFonts w:ascii="BRH Malayalam Extra" w:eastAsia="Times New Roman" w:hAnsi="BRH Malayalam Extra" w:cs="BRH Malayalam Extra"/>
+                <w:color w:val="000000"/>
+                <w:sz w:val="32"/>
+                <w:szCs w:val="40"/>
+                <w:lang w:eastAsia="en-IN" w:bidi="ml-IN"/>
+              </w:rPr>
+              <w:t>–</w:t>
+            </w:r>
+            <w:r>
+              <w:rPr>
+                <w:rFonts w:ascii="BRH Malayalam Extra" w:eastAsia="Times New Roman" w:hAnsi="BRH Malayalam Extra" w:cs="BRH Malayalam Extra"/>
+                <w:color w:val="000000"/>
+                <w:sz w:val="40"/>
+                <w:szCs w:val="40"/>
+                <w:lang w:eastAsia="en-IN" w:bidi="ml-IN"/>
+              </w:rPr>
+              <w:t>ª</w:t>
+            </w:r>
+            <w:r>
+              <w:rPr>
+                <w:rFonts w:ascii="BRH Malayalam Extra" w:eastAsia="Times New Roman" w:hAnsi="BRH Malayalam Extra" w:cs="BRH Malayalam Extra"/>
+                <w:color w:val="000000"/>
+                <w:sz w:val="32"/>
+                <w:szCs w:val="40"/>
+                <w:lang w:eastAsia="en-IN" w:bidi="ml-IN"/>
+              </w:rPr>
+              <w:t>–</w:t>
+            </w:r>
+            <w:r>
+              <w:rPr>
+                <w:rFonts w:ascii="BRH Malayalam Extra" w:eastAsia="Times New Roman" w:hAnsi="BRH Malayalam Extra" w:cs="BRH Malayalam Extra"/>
+                <w:color w:val="000000"/>
+                <w:sz w:val="40"/>
+                <w:szCs w:val="40"/>
+                <w:lang w:eastAsia="en-IN" w:bidi="ml-IN"/>
+              </w:rPr>
+              <w:t>.E</w:t>
+            </w:r>
+            <w:r>
+              <w:rPr>
+                <w:rFonts w:ascii="BRH Malayalam Extra" w:eastAsia="Times New Roman" w:hAnsi="BRH Malayalam Extra" w:cs="BRH Malayalam Extra"/>
+                <w:color w:val="000000"/>
+                <w:sz w:val="32"/>
+                <w:szCs w:val="40"/>
+                <w:lang w:eastAsia="en-IN" w:bidi="ml-IN"/>
+              </w:rPr>
+              <w:t>–</w:t>
+            </w:r>
+            <w:r>
+              <w:rPr>
+                <w:rFonts w:ascii="BRH Malayalam Extra" w:eastAsia="Times New Roman" w:hAnsi="BRH Malayalam Extra" w:cs="BRH Malayalam Extra"/>
+                <w:color w:val="000000"/>
+                <w:sz w:val="40"/>
+                <w:szCs w:val="40"/>
+                <w:lang w:eastAsia="en-IN" w:bidi="ml-IN"/>
+              </w:rPr>
+              <w:t>Zy</w:t>
+            </w:r>
+            <w:r>
+              <w:rPr>
+                <w:rFonts w:ascii="BRH Malayalam Extra" w:eastAsia="Times New Roman" w:hAnsi="BRH Malayalam Extra" w:cs="BRH Malayalam Extra"/>
+                <w:color w:val="000000"/>
+                <w:sz w:val="32"/>
+                <w:szCs w:val="40"/>
+                <w:lang w:eastAsia="en-IN" w:bidi="ml-IN"/>
+              </w:rPr>
+              <w:t>–</w:t>
+            </w:r>
+            <w:r>
+              <w:rPr>
+                <w:rFonts w:ascii="BRH Malayalam Extra" w:eastAsia="Times New Roman" w:hAnsi="BRH Malayalam Extra" w:cs="BRH Malayalam Extra"/>
+                <w:color w:val="000000"/>
+                <w:sz w:val="40"/>
+                <w:szCs w:val="40"/>
+                <w:lang w:eastAsia="en-IN" w:bidi="ml-IN"/>
+              </w:rPr>
+              <w:t>¥mx</w:t>
+            </w:r>
+            <w:r>
+              <w:rPr>
+                <w:rFonts w:ascii="BRH Malayalam Extra" w:eastAsia="Times New Roman" w:hAnsi="BRH Malayalam Extra" w:cs="BRH Malayalam Extra"/>
+                <w:color w:val="000000"/>
+                <w:sz w:val="32"/>
+                <w:szCs w:val="40"/>
+                <w:lang w:eastAsia="en-IN" w:bidi="ml-IN"/>
+              </w:rPr>
+              <w:t>–</w:t>
+            </w:r>
+            <w:r>
+              <w:rPr>
+                <w:rFonts w:ascii="BRH Malayalam Extra" w:eastAsia="Times New Roman" w:hAnsi="BRH Malayalam Extra" w:cs="BRH Malayalam Extra"/>
+                <w:color w:val="000000"/>
+                <w:sz w:val="40"/>
+                <w:szCs w:val="40"/>
+                <w:lang w:eastAsia="en-IN" w:bidi="ml-IN"/>
+              </w:rPr>
+              <w:t>¥K |</w:t>
+            </w:r>
+          </w:p>
+        </w:tc>
+        <w:tc>
+          <w:tcPr>
+            <w:tcW w:w="5386" w:type="dxa"/>
+          </w:tcPr>
+          <w:p>
+            <w:pPr>
+              <w:widowControl w:val="0"/>
+              <w:autoSpaceDE w:val="0"/>
+              <w:autoSpaceDN w:val="0"/>
+              <w:adjustRightInd w:val="0"/>
+              <w:spacing w:before="0" w:line="240" w:lineRule="auto"/>
+              <w:rPr>
+                <w:rFonts w:ascii="BRH Malayalam Extra" w:eastAsia="Times New Roman" w:hAnsi="BRH Malayalam Extra" w:cs="BRH Malayalam Extra"/>
+                <w:color w:val="000000"/>
+                <w:sz w:val="40"/>
+                <w:szCs w:val="40"/>
+                <w:lang w:eastAsia="en-IN" w:bidi="ml-IN"/>
+              </w:rPr>
+            </w:pPr>
+            <w:r>
+              <w:rPr>
+                <w:rFonts w:ascii="BRH Malayalam Extra" w:eastAsia="Times New Roman" w:hAnsi="BRH Malayalam Extra" w:cs="BRH Malayalam Extra"/>
+                <w:color w:val="000000"/>
+                <w:sz w:val="40"/>
+                <w:szCs w:val="40"/>
+                <w:lang w:eastAsia="en-IN" w:bidi="ml-IN"/>
+              </w:rPr>
+              <w:t xml:space="preserve">De— Zyrç¥Ç | </w:t>
+            </w:r>
+          </w:p>
+          <w:p>
+            <w:pPr>
+              <w:widowControl w:val="0"/>
+              <w:autoSpaceDE w:val="0"/>
+              <w:autoSpaceDN w:val="0"/>
+              <w:adjustRightInd w:val="0"/>
+              <w:spacing w:before="0" w:line="240" w:lineRule="auto"/>
+              <w:rPr>
+                <w:rFonts w:ascii="BRH Devanagari Extra" w:hAnsi="BRH Devanagari Extra" w:cs="BRH Devanagari Extra"/>
+                <w:color w:val="000000"/>
+                <w:sz w:val="40"/>
+                <w:szCs w:val="40"/>
+              </w:rPr>
+            </w:pPr>
+            <w:r>
+              <w:rPr>
+                <w:rFonts w:ascii="BRH Malayalam Extra" w:eastAsia="Times New Roman" w:hAnsi="BRH Malayalam Extra" w:cs="BRH Malayalam Extra"/>
+                <w:color w:val="000000"/>
+                <w:sz w:val="40"/>
+                <w:szCs w:val="40"/>
+                <w:lang w:eastAsia="en-IN" w:bidi="ml-IN"/>
+              </w:rPr>
+              <w:t>Zy</w:t>
+            </w:r>
+            <w:r>
+              <w:rPr>
+                <w:rFonts w:ascii="BRH Malayalam Extra" w:eastAsia="Times New Roman" w:hAnsi="BRH Malayalam Extra" w:cs="BRH Malayalam Extra"/>
+                <w:color w:val="000000"/>
+                <w:sz w:val="32"/>
+                <w:szCs w:val="40"/>
+                <w:lang w:eastAsia="en-IN" w:bidi="ml-IN"/>
+              </w:rPr>
+              <w:t>–</w:t>
+            </w:r>
+            <w:r>
+              <w:rPr>
+                <w:rFonts w:ascii="BRH Malayalam Extra" w:eastAsia="Times New Roman" w:hAnsi="BRH Malayalam Extra" w:cs="BRH Malayalam Extra"/>
+                <w:color w:val="000000"/>
+                <w:sz w:val="40"/>
+                <w:szCs w:val="40"/>
+                <w:highlight w:val="green"/>
+                <w:lang w:eastAsia="en-IN" w:bidi="ml-IN"/>
+              </w:rPr>
+              <w:t>r</w:t>
+            </w:r>
+            <w:r>
+              <w:rPr>
+                <w:rFonts w:ascii="BRH Malayalam Extra" w:eastAsia="Times New Roman" w:hAnsi="BRH Malayalam Extra" w:cs="BRH Malayalam Extra"/>
+                <w:color w:val="000000"/>
+                <w:sz w:val="40"/>
+                <w:szCs w:val="40"/>
+                <w:lang w:eastAsia="en-IN" w:bidi="ml-IN"/>
+              </w:rPr>
+              <w:t>ç</w:t>
+            </w:r>
+            <w:r>
+              <w:rPr>
+                <w:rFonts w:ascii="BRH Malayalam Extra" w:eastAsia="Times New Roman" w:hAnsi="BRH Malayalam Extra" w:cs="BRH Malayalam Extra"/>
+                <w:color w:val="000000"/>
+                <w:sz w:val="32"/>
+                <w:szCs w:val="40"/>
+                <w:lang w:eastAsia="en-IN" w:bidi="ml-IN"/>
+              </w:rPr>
+              <w:t>–</w:t>
+            </w:r>
+            <w:r>
+              <w:rPr>
+                <w:rFonts w:ascii="BRH Malayalam Extra" w:eastAsia="Times New Roman" w:hAnsi="BRH Malayalam Extra" w:cs="BRH Malayalam Extra"/>
+                <w:color w:val="000000"/>
+                <w:sz w:val="40"/>
+                <w:szCs w:val="40"/>
+                <w:lang w:eastAsia="en-IN" w:bidi="ml-IN"/>
+              </w:rPr>
+              <w:t>¥Ç</w:t>
+            </w:r>
+            <w:r>
+              <w:rPr>
+                <w:rFonts w:ascii="BRH Malayalam Extra" w:eastAsia="Times New Roman" w:hAnsi="BRH Malayalam Extra" w:cs="BRH Malayalam Extra"/>
+                <w:color w:val="000000"/>
+                <w:sz w:val="32"/>
+                <w:szCs w:val="40"/>
+                <w:lang w:eastAsia="en-IN" w:bidi="ml-IN"/>
+              </w:rPr>
+              <w:t>–</w:t>
+            </w:r>
+            <w:r>
+              <w:rPr>
+                <w:rFonts w:ascii="BRH Malayalam Extra" w:eastAsia="Times New Roman" w:hAnsi="BRH Malayalam Extra" w:cs="BRH Malayalam Extra"/>
+                <w:color w:val="000000"/>
+                <w:sz w:val="40"/>
+                <w:szCs w:val="40"/>
+                <w:lang w:eastAsia="en-IN" w:bidi="ml-IN"/>
+              </w:rPr>
+              <w:t xml:space="preserve"> dy</w:t>
+            </w:r>
+            <w:r>
+              <w:rPr>
+                <w:rFonts w:ascii="BRH Malayalam Extra" w:eastAsia="Times New Roman" w:hAnsi="BRH Malayalam Extra" w:cs="BRH Malayalam Extra"/>
+                <w:color w:val="000000"/>
+                <w:sz w:val="32"/>
+                <w:szCs w:val="40"/>
+                <w:lang w:eastAsia="en-IN" w:bidi="ml-IN"/>
+              </w:rPr>
+              <w:t>–</w:t>
+            </w:r>
+            <w:r>
+              <w:rPr>
+                <w:rFonts w:ascii="BRH Malayalam Extra" w:eastAsia="Times New Roman" w:hAnsi="BRH Malayalam Extra" w:cs="BRH Malayalam Extra"/>
+                <w:color w:val="000000"/>
+                <w:sz w:val="40"/>
+                <w:szCs w:val="40"/>
+                <w:lang w:eastAsia="en-IN" w:bidi="ml-IN"/>
+              </w:rPr>
+              <w:t>ª</w:t>
+            </w:r>
+            <w:r>
+              <w:rPr>
+                <w:rFonts w:ascii="BRH Malayalam Extra" w:eastAsia="Times New Roman" w:hAnsi="BRH Malayalam Extra" w:cs="BRH Malayalam Extra"/>
+                <w:color w:val="000000"/>
+                <w:sz w:val="32"/>
+                <w:szCs w:val="40"/>
+                <w:lang w:eastAsia="en-IN" w:bidi="ml-IN"/>
+              </w:rPr>
+              <w:t>–</w:t>
+            </w:r>
+            <w:r>
+              <w:rPr>
+                <w:rFonts w:ascii="BRH Malayalam Extra" w:eastAsia="Times New Roman" w:hAnsi="BRH Malayalam Extra" w:cs="BRH Malayalam Extra"/>
+                <w:color w:val="000000"/>
+                <w:sz w:val="40"/>
+                <w:szCs w:val="40"/>
+                <w:lang w:eastAsia="en-IN" w:bidi="ml-IN"/>
+              </w:rPr>
+              <w:t>.E</w:t>
+            </w:r>
+            <w:r>
+              <w:rPr>
+                <w:rFonts w:ascii="BRH Malayalam Extra" w:eastAsia="Times New Roman" w:hAnsi="BRH Malayalam Extra" w:cs="BRH Malayalam Extra"/>
+                <w:color w:val="000000"/>
+                <w:sz w:val="32"/>
+                <w:szCs w:val="40"/>
+                <w:lang w:eastAsia="en-IN" w:bidi="ml-IN"/>
+              </w:rPr>
+              <w:t>–</w:t>
+            </w:r>
+            <w:r>
+              <w:rPr>
+                <w:rFonts w:ascii="BRH Malayalam Extra" w:eastAsia="Times New Roman" w:hAnsi="BRH Malayalam Extra" w:cs="BRH Malayalam Extra"/>
+                <w:color w:val="000000"/>
+                <w:sz w:val="40"/>
+                <w:szCs w:val="40"/>
+                <w:lang w:eastAsia="en-IN" w:bidi="ml-IN"/>
+              </w:rPr>
+              <w:t>Zy</w:t>
+            </w:r>
+            <w:r>
+              <w:rPr>
+                <w:rFonts w:ascii="BRH Malayalam Extra" w:eastAsia="Times New Roman" w:hAnsi="BRH Malayalam Extra" w:cs="BRH Malayalam Extra"/>
+                <w:color w:val="000000"/>
+                <w:sz w:val="32"/>
+                <w:szCs w:val="40"/>
+                <w:lang w:eastAsia="en-IN" w:bidi="ml-IN"/>
+              </w:rPr>
+              <w:t>–</w:t>
+            </w:r>
+            <w:r>
+              <w:rPr>
+                <w:rFonts w:ascii="BRH Malayalam Extra" w:eastAsia="Times New Roman" w:hAnsi="BRH Malayalam Extra" w:cs="BRH Malayalam Extra"/>
+                <w:color w:val="000000"/>
+                <w:sz w:val="40"/>
+                <w:szCs w:val="40"/>
+                <w:lang w:eastAsia="en-IN" w:bidi="ml-IN"/>
+              </w:rPr>
+              <w:t>¥mx</w:t>
+            </w:r>
+            <w:r>
+              <w:rPr>
+                <w:rFonts w:ascii="BRH Malayalam Extra" w:eastAsia="Times New Roman" w:hAnsi="BRH Malayalam Extra" w:cs="BRH Malayalam Extra"/>
+                <w:color w:val="000000"/>
+                <w:sz w:val="32"/>
+                <w:szCs w:val="40"/>
+                <w:lang w:eastAsia="en-IN" w:bidi="ml-IN"/>
+              </w:rPr>
+              <w:t>–</w:t>
+            </w:r>
+            <w:r>
+              <w:rPr>
+                <w:rFonts w:ascii="BRH Malayalam Extra" w:eastAsia="Times New Roman" w:hAnsi="BRH Malayalam Extra" w:cs="BRH Malayalam Extra"/>
+                <w:color w:val="000000"/>
+                <w:sz w:val="40"/>
+                <w:szCs w:val="40"/>
+                <w:lang w:eastAsia="en-IN" w:bidi="ml-IN"/>
+              </w:rPr>
+              <w:t>¥K |</w:t>
             </w:r>
           </w:p>
         </w:tc>
@@ -972,7 +2700,7 @@
               <w:autoSpaceDE w:val="0"/>
               <w:autoSpaceDN w:val="0"/>
               <w:adjustRightInd w:val="0"/>
-              <w:spacing w:before="0" w:line="252" w:lineRule="auto"/>
+              <w:spacing w:before="0" w:line="240" w:lineRule="auto"/>
               <w:ind w:right="297"/>
               <w:rPr>
                 <w:rFonts w:cs="Arial"/>
@@ -988,6 +2716,7 @@
                 <w:sz w:val="28"/>
                 <w:szCs w:val="32"/>
               </w:rPr>
+              <w:lastRenderedPageBreak/>
               <w:t>T.S.5.2.</w:t>
             </w:r>
             <w:r>
@@ -1018,7 +2747,7 @@
               <w:autoSpaceDE w:val="0"/>
               <w:autoSpaceDN w:val="0"/>
               <w:adjustRightInd w:val="0"/>
-              <w:spacing w:before="0" w:line="252" w:lineRule="auto"/>
+              <w:spacing w:before="0" w:line="240" w:lineRule="auto"/>
               <w:ind w:right="297"/>
               <w:rPr>
                 <w:rFonts w:cs="Arial"/>
@@ -1058,7 +2787,7 @@
               <w:autoSpaceDE w:val="0"/>
               <w:autoSpaceDN w:val="0"/>
               <w:adjustRightInd w:val="0"/>
-              <w:spacing w:before="0" w:line="252" w:lineRule="auto"/>
+              <w:spacing w:before="0" w:line="240" w:lineRule="auto"/>
               <w:ind w:right="297"/>
               <w:rPr>
                 <w:rFonts w:cs="Arial"/>
@@ -1362,7 +3091,7 @@
               <w:autoSpaceDE w:val="0"/>
               <w:autoSpaceDN w:val="0"/>
               <w:adjustRightInd w:val="0"/>
-              <w:spacing w:before="0" w:line="252" w:lineRule="auto"/>
+              <w:spacing w:before="0" w:line="240" w:lineRule="auto"/>
               <w:ind w:right="297"/>
               <w:rPr>
                 <w:rFonts w:cs="Arial"/>
@@ -1408,7 +3137,7 @@
               <w:autoSpaceDE w:val="0"/>
               <w:autoSpaceDN w:val="0"/>
               <w:adjustRightInd w:val="0"/>
-              <w:spacing w:before="0" w:line="252" w:lineRule="auto"/>
+              <w:spacing w:before="0" w:line="240" w:lineRule="auto"/>
               <w:ind w:right="297"/>
               <w:rPr>
                 <w:rFonts w:cs="Arial"/>
@@ -1438,7 +3167,7 @@
               <w:autoSpaceDE w:val="0"/>
               <w:autoSpaceDN w:val="0"/>
               <w:adjustRightInd w:val="0"/>
-              <w:spacing w:before="0" w:line="252" w:lineRule="auto"/>
+              <w:spacing w:before="0" w:line="240" w:lineRule="auto"/>
               <w:ind w:right="297"/>
               <w:rPr>
                 <w:rFonts w:cs="Arial"/>
@@ -1489,7 +3218,7 @@
               <w:autoSpaceDE w:val="0"/>
               <w:autoSpaceDN w:val="0"/>
               <w:adjustRightInd w:val="0"/>
-              <w:spacing w:line="252" w:lineRule="auto"/>
+              <w:spacing w:before="0" w:line="240" w:lineRule="auto"/>
               <w:rPr>
                 <w:rFonts w:ascii="BRH Malayalam Extra" w:eastAsia="Times New Roman" w:hAnsi="BRH Malayalam Extra" w:cs="BRH Malayalam Extra"/>
                 <w:color w:val="000000"/>
@@ -1687,7 +3416,7 @@
               <w:autoSpaceDE w:val="0"/>
               <w:autoSpaceDN w:val="0"/>
               <w:adjustRightInd w:val="0"/>
-              <w:spacing w:line="252" w:lineRule="auto"/>
+              <w:spacing w:before="0" w:line="240" w:lineRule="auto"/>
               <w:rPr>
                 <w:rFonts w:ascii="BRH Malayalam Extra" w:eastAsia="Times New Roman" w:hAnsi="BRH Malayalam Extra" w:cs="BRH Malayalam Extra"/>
                 <w:color w:val="000000"/>
@@ -1873,7 +3602,7 @@
               <w:autoSpaceDE w:val="0"/>
               <w:autoSpaceDN w:val="0"/>
               <w:adjustRightInd w:val="0"/>
-              <w:spacing w:before="0" w:line="252" w:lineRule="auto"/>
+              <w:spacing w:before="0" w:line="240" w:lineRule="auto"/>
               <w:ind w:right="297"/>
               <w:rPr>
                 <w:rFonts w:cs="Arial"/>
@@ -1907,16 +3636,7 @@
                 <w:sz w:val="28"/>
                 <w:szCs w:val="32"/>
               </w:rPr>
-              <w:t>.</w:t>
-            </w:r>
-            <w:r>
-              <w:rPr>
-                <w:rFonts w:cs="Arial"/>
-                <w:b/>
-                <w:sz w:val="28"/>
-                <w:szCs w:val="32"/>
-              </w:rPr>
-              <w:t>3</w:t>
+              <w:t>.3</w:t>
             </w:r>
             <w:r>
               <w:rPr>
@@ -1937,7 +3657,7 @@
               <w:autoSpaceDE w:val="0"/>
               <w:autoSpaceDN w:val="0"/>
               <w:adjustRightInd w:val="0"/>
-              <w:spacing w:before="0" w:line="252" w:lineRule="auto"/>
+              <w:spacing w:before="0" w:line="240" w:lineRule="auto"/>
               <w:ind w:right="297"/>
               <w:rPr>
                 <w:rFonts w:cs="Arial"/>
@@ -1977,7 +3697,7 @@
               <w:autoSpaceDE w:val="0"/>
               <w:autoSpaceDN w:val="0"/>
               <w:adjustRightInd w:val="0"/>
-              <w:spacing w:before="0" w:line="252" w:lineRule="auto"/>
+              <w:spacing w:before="0" w:line="240" w:lineRule="auto"/>
               <w:ind w:right="297"/>
               <w:rPr>
                 <w:rFonts w:cs="Arial"/>
@@ -2028,7 +3748,7 @@
               <w:autoSpaceDE w:val="0"/>
               <w:autoSpaceDN w:val="0"/>
               <w:adjustRightInd w:val="0"/>
-              <w:spacing w:line="252" w:lineRule="auto"/>
+              <w:spacing w:before="0" w:line="240" w:lineRule="auto"/>
               <w:rPr>
                 <w:rFonts w:ascii="BRH Malayalam Extra" w:eastAsia="Times New Roman" w:hAnsi="BRH Malayalam Extra" w:cs="BRH Malayalam Extra"/>
                 <w:color w:val="000000"/>
@@ -2198,7 +3918,6 @@
                 <w:szCs w:val="40"/>
                 <w:lang w:val="it-IT" w:eastAsia="en-IN" w:bidi="ml-IN"/>
               </w:rPr>
-              <w:lastRenderedPageBreak/>
               <w:t>öZy</w:t>
             </w:r>
             <w:r>
@@ -2253,24 +3972,23 @@
               <w:autoSpaceDE w:val="0"/>
               <w:autoSpaceDN w:val="0"/>
               <w:adjustRightInd w:val="0"/>
-              <w:spacing w:line="252" w:lineRule="auto"/>
-              <w:rPr>
-                <w:rFonts w:ascii="BRH Malayalam Extra" w:eastAsia="Times New Roman" w:hAnsi="BRH Malayalam Extra" w:cs="BRH Malayalam Extra"/>
-                <w:color w:val="000000"/>
-                <w:sz w:val="40"/>
-                <w:szCs w:val="40"/>
-                <w:lang w:val="it-IT" w:eastAsia="en-IN" w:bidi="ml-IN"/>
-              </w:rPr>
-            </w:pPr>
-            <w:r>
-              <w:rPr>
-                <w:rFonts w:ascii="BRH Malayalam Extra" w:eastAsia="Times New Roman" w:hAnsi="BRH Malayalam Extra" w:cs="BRH Malayalam Extra"/>
-                <w:color w:val="000000"/>
-                <w:sz w:val="40"/>
-                <w:szCs w:val="40"/>
-                <w:lang w:val="it-IT" w:eastAsia="en-IN" w:bidi="ml-IN"/>
-              </w:rPr>
-              <w:lastRenderedPageBreak/>
+              <w:spacing w:before="0" w:line="240" w:lineRule="auto"/>
+              <w:rPr>
+                <w:rFonts w:ascii="BRH Malayalam Extra" w:eastAsia="Times New Roman" w:hAnsi="BRH Malayalam Extra" w:cs="BRH Malayalam Extra"/>
+                <w:color w:val="000000"/>
+                <w:sz w:val="40"/>
+                <w:szCs w:val="40"/>
+                <w:lang w:val="it-IT" w:eastAsia="en-IN" w:bidi="ml-IN"/>
+              </w:rPr>
+            </w:pPr>
+            <w:r>
+              <w:rPr>
+                <w:rFonts w:ascii="BRH Malayalam Extra" w:eastAsia="Times New Roman" w:hAnsi="BRH Malayalam Extra" w:cs="BRH Malayalam Extra"/>
+                <w:color w:val="000000"/>
+                <w:sz w:val="40"/>
+                <w:szCs w:val="40"/>
+                <w:lang w:val="it-IT" w:eastAsia="en-IN" w:bidi="ml-IN"/>
+              </w:rPr>
               <w:t>öhxZ£—põpZ</w:t>
             </w:r>
             <w:r>
@@ -2414,7 +4132,6 @@
                 <w:szCs w:val="40"/>
                 <w:lang w:val="it-IT" w:eastAsia="en-IN" w:bidi="ml-IN"/>
               </w:rPr>
-              <w:lastRenderedPageBreak/>
               <w:t>öZy</w:t>
             </w:r>
             <w:r>
@@ -2477,7 +4194,7 @@
               <w:autoSpaceDE w:val="0"/>
               <w:autoSpaceDN w:val="0"/>
               <w:adjustRightInd w:val="0"/>
-              <w:spacing w:before="0" w:line="252" w:lineRule="auto"/>
+              <w:spacing w:before="0" w:line="240" w:lineRule="auto"/>
               <w:ind w:right="297"/>
               <w:rPr>
                 <w:rFonts w:cs="Arial"/>
@@ -2493,7 +4210,6 @@
                 <w:sz w:val="28"/>
                 <w:szCs w:val="32"/>
               </w:rPr>
-              <w:lastRenderedPageBreak/>
               <w:t>T.S.5.2.</w:t>
             </w:r>
             <w:r>
@@ -2503,16 +4219,7 @@
                 <w:sz w:val="28"/>
                 <w:szCs w:val="32"/>
               </w:rPr>
-              <w:t>7.</w:t>
-            </w:r>
-            <w:r>
-              <w:rPr>
-                <w:rFonts w:cs="Arial"/>
-                <w:b/>
-                <w:sz w:val="28"/>
-                <w:szCs w:val="32"/>
-              </w:rPr>
-              <w:t>3</w:t>
+              <w:t>7.3</w:t>
             </w:r>
             <w:r>
               <w:rPr>
@@ -2533,35 +4240,25 @@
               <w:autoSpaceDE w:val="0"/>
               <w:autoSpaceDN w:val="0"/>
               <w:adjustRightInd w:val="0"/>
-              <w:spacing w:before="0" w:line="252" w:lineRule="auto"/>
+              <w:spacing w:before="0" w:line="240" w:lineRule="auto"/>
               <w:ind w:right="297"/>
               <w:rPr>
                 <w:rFonts w:cs="Arial"/>
                 <w:b/>
                 <w:sz w:val="28"/>
                 <w:szCs w:val="32"/>
-                <w:lang w:val="it-IT"/>
-              </w:rPr>
-            </w:pPr>
-            <w:r>
-              <w:rPr>
-                <w:rFonts w:cs="Arial"/>
-                <w:b/>
-                <w:sz w:val="28"/>
-                <w:szCs w:val="32"/>
-                <w:lang w:val="it-IT"/>
-              </w:rPr>
-              <w:t xml:space="preserve">Krama Vaakyam No.– </w:t>
-            </w:r>
-            <w:r>
-              <w:rPr>
-                <w:rFonts w:cs="Arial"/>
-                <w:b/>
-                <w:sz w:val="28"/>
-                <w:szCs w:val="32"/>
-                <w:lang w:val="it-IT"/>
-              </w:rPr>
-              <w:t>38</w:t>
+                <w:lang w:val="en-IN"/>
+              </w:rPr>
+            </w:pPr>
+            <w:r>
+              <w:rPr>
+                <w:rFonts w:cs="Arial"/>
+                <w:b/>
+                <w:sz w:val="28"/>
+                <w:szCs w:val="32"/>
+                <w:lang w:val="en-IN"/>
+              </w:rPr>
+              <w:t>Krama Vaakyam No.– 38</w:t>
             </w:r>
           </w:p>
           <w:p>
@@ -2573,7 +4270,7 @@
               <w:autoSpaceDE w:val="0"/>
               <w:autoSpaceDN w:val="0"/>
               <w:adjustRightInd w:val="0"/>
-              <w:spacing w:before="0" w:line="252" w:lineRule="auto"/>
+              <w:spacing w:before="0" w:line="240" w:lineRule="auto"/>
               <w:ind w:right="297"/>
               <w:rPr>
                 <w:rFonts w:cs="Arial"/>
@@ -2610,17 +4307,7 @@
                 <w:szCs w:val="32"/>
                 <w:lang w:val="it-IT"/>
               </w:rPr>
-              <w:t>3</w:t>
-            </w:r>
-            <w:r>
-              <w:rPr>
-                <w:rFonts w:cs="Arial"/>
-                <w:b/>
-                <w:sz w:val="28"/>
-                <w:szCs w:val="32"/>
-                <w:lang w:val="it-IT"/>
-              </w:rPr>
-              <w:t>8</w:t>
+              <w:t>38</w:t>
             </w:r>
           </w:p>
         </w:tc>
@@ -2634,22 +4321,22 @@
               <w:autoSpaceDE w:val="0"/>
               <w:autoSpaceDN w:val="0"/>
               <w:adjustRightInd w:val="0"/>
-              <w:spacing w:line="252" w:lineRule="auto"/>
-              <w:rPr>
-                <w:rFonts w:ascii="BRH Malayalam Extra" w:eastAsia="Times New Roman" w:hAnsi="BRH Malayalam Extra" w:cs="BRH Malayalam Extra"/>
-                <w:color w:val="000000"/>
-                <w:sz w:val="40"/>
-                <w:szCs w:val="40"/>
-                <w:lang w:eastAsia="en-IN" w:bidi="ml-IN"/>
-              </w:rPr>
-            </w:pPr>
-            <w:r>
-              <w:rPr>
-                <w:rFonts w:ascii="BRH Malayalam Extra" w:eastAsia="Times New Roman" w:hAnsi="BRH Malayalam Extra" w:cs="BRH Malayalam Extra"/>
-                <w:color w:val="000000"/>
-                <w:sz w:val="40"/>
-                <w:szCs w:val="40"/>
-                <w:lang w:eastAsia="en-IN" w:bidi="ml-IN"/>
+              <w:spacing w:before="0" w:line="240" w:lineRule="auto"/>
+              <w:rPr>
+                <w:rFonts w:ascii="BRH Malayalam Extra" w:eastAsia="Times New Roman" w:hAnsi="BRH Malayalam Extra" w:cs="BRH Malayalam Extra"/>
+                <w:color w:val="000000"/>
+                <w:sz w:val="40"/>
+                <w:szCs w:val="40"/>
+                <w:lang w:val="it-IT" w:eastAsia="en-IN" w:bidi="ml-IN"/>
+              </w:rPr>
+            </w:pPr>
+            <w:r>
+              <w:rPr>
+                <w:rFonts w:ascii="BRH Malayalam Extra" w:eastAsia="Times New Roman" w:hAnsi="BRH Malayalam Extra" w:cs="BRH Malayalam Extra"/>
+                <w:color w:val="000000"/>
+                <w:sz w:val="40"/>
+                <w:szCs w:val="40"/>
+                <w:lang w:val="it-IT" w:eastAsia="en-IN" w:bidi="ml-IN"/>
               </w:rPr>
               <w:t>Óx</w:t>
             </w:r>
@@ -2659,17 +4346,17 @@
                 <w:color w:val="000000"/>
                 <w:sz w:val="32"/>
                 <w:szCs w:val="40"/>
-                <w:lang w:eastAsia="en-IN" w:bidi="ml-IN"/>
-              </w:rPr>
-              <w:t>–</w:t>
-            </w:r>
-            <w:r>
-              <w:rPr>
-                <w:rFonts w:ascii="BRH Malayalam Extra" w:eastAsia="Times New Roman" w:hAnsi="BRH Malayalam Extra" w:cs="BRH Malayalam Extra"/>
-                <w:color w:val="000000"/>
-                <w:sz w:val="40"/>
-                <w:szCs w:val="40"/>
-                <w:lang w:eastAsia="en-IN" w:bidi="ml-IN"/>
+                <w:lang w:val="it-IT" w:eastAsia="en-IN" w:bidi="ml-IN"/>
+              </w:rPr>
+              <w:t>–</w:t>
+            </w:r>
+            <w:r>
+              <w:rPr>
+                <w:rFonts w:ascii="BRH Malayalam Extra" w:eastAsia="Times New Roman" w:hAnsi="BRH Malayalam Extra" w:cs="BRH Malayalam Extra"/>
+                <w:color w:val="000000"/>
+                <w:sz w:val="40"/>
+                <w:szCs w:val="40"/>
+                <w:lang w:val="it-IT" w:eastAsia="en-IN" w:bidi="ml-IN"/>
               </w:rPr>
               <w:t>e</w:t>
             </w:r>
@@ -2679,17 +4366,17 @@
                 <w:color w:val="000000"/>
                 <w:sz w:val="32"/>
                 <w:szCs w:val="40"/>
-                <w:lang w:eastAsia="en-IN" w:bidi="ml-IN"/>
-              </w:rPr>
-              <w:t>–</w:t>
-            </w:r>
-            <w:r>
-              <w:rPr>
-                <w:rFonts w:ascii="BRH Malayalam Extra" w:eastAsia="Times New Roman" w:hAnsi="BRH Malayalam Extra" w:cs="BRH Malayalam Extra"/>
-                <w:color w:val="000000"/>
-                <w:sz w:val="40"/>
-                <w:szCs w:val="40"/>
-                <w:lang w:eastAsia="en-IN" w:bidi="ml-IN"/>
+                <w:lang w:val="it-IT" w:eastAsia="en-IN" w:bidi="ml-IN"/>
+              </w:rPr>
+              <w:t>–</w:t>
+            </w:r>
+            <w:r>
+              <w:rPr>
+                <w:rFonts w:ascii="BRH Malayalam Extra" w:eastAsia="Times New Roman" w:hAnsi="BRH Malayalam Extra" w:cs="BRH Malayalam Extra"/>
+                <w:color w:val="000000"/>
+                <w:sz w:val="40"/>
+                <w:szCs w:val="40"/>
+                <w:lang w:val="it-IT" w:eastAsia="en-IN" w:bidi="ml-IN"/>
               </w:rPr>
               <w:t>j</w:t>
             </w:r>
@@ -2699,17 +4386,17 @@
                 <w:color w:val="000000"/>
                 <w:sz w:val="32"/>
                 <w:szCs w:val="40"/>
-                <w:lang w:eastAsia="en-IN" w:bidi="ml-IN"/>
-              </w:rPr>
-              <w:t>–</w:t>
-            </w:r>
-            <w:r>
-              <w:rPr>
-                <w:rFonts w:ascii="BRH Malayalam Extra" w:eastAsia="Times New Roman" w:hAnsi="BRH Malayalam Extra" w:cs="BRH Malayalam Extra"/>
-                <w:color w:val="000000"/>
-                <w:sz w:val="40"/>
-                <w:szCs w:val="40"/>
-                <w:lang w:eastAsia="en-IN" w:bidi="ml-IN"/>
+                <w:lang w:val="it-IT" w:eastAsia="en-IN" w:bidi="ml-IN"/>
+              </w:rPr>
+              <w:t>–</w:t>
+            </w:r>
+            <w:r>
+              <w:rPr>
+                <w:rFonts w:ascii="BRH Malayalam Extra" w:eastAsia="Times New Roman" w:hAnsi="BRH Malayalam Extra" w:cs="BRH Malayalam Extra"/>
+                <w:color w:val="000000"/>
+                <w:sz w:val="40"/>
+                <w:szCs w:val="40"/>
+                <w:lang w:val="it-IT" w:eastAsia="en-IN" w:bidi="ml-IN"/>
               </w:rPr>
               <w:t>Zy</w:t>
             </w:r>
@@ -2719,17 +4406,17 @@
                 <w:color w:val="000000"/>
                 <w:sz w:val="32"/>
                 <w:szCs w:val="40"/>
-                <w:lang w:eastAsia="en-IN" w:bidi="ml-IN"/>
-              </w:rPr>
-              <w:t>–</w:t>
-            </w:r>
-            <w:r>
-              <w:rPr>
-                <w:rFonts w:ascii="BRH Malayalam Extra" w:eastAsia="Times New Roman" w:hAnsi="BRH Malayalam Extra" w:cs="BRH Malayalam Extra"/>
-                <w:color w:val="000000"/>
-                <w:sz w:val="40"/>
-                <w:szCs w:val="40"/>
-                <w:lang w:eastAsia="en-IN" w:bidi="ml-IN"/>
+                <w:lang w:val="it-IT" w:eastAsia="en-IN" w:bidi="ml-IN"/>
+              </w:rPr>
+              <w:t>–</w:t>
+            </w:r>
+            <w:r>
+              <w:rPr>
+                <w:rFonts w:ascii="BRH Malayalam Extra" w:eastAsia="Times New Roman" w:hAnsi="BRH Malayalam Extra" w:cs="BRH Malayalam Extra"/>
+                <w:color w:val="000000"/>
+                <w:sz w:val="40"/>
+                <w:szCs w:val="40"/>
+                <w:lang w:val="it-IT" w:eastAsia="en-IN" w:bidi="ml-IN"/>
               </w:rPr>
               <w:t xml:space="preserve"> </w:t>
             </w:r>
@@ -2740,7 +4427,7 @@
                 <w:sz w:val="40"/>
                 <w:szCs w:val="40"/>
                 <w:highlight w:val="yellow"/>
-                <w:lang w:eastAsia="en-IN" w:bidi="ml-IN"/>
+                <w:lang w:val="it-IT" w:eastAsia="en-IN" w:bidi="ml-IN"/>
               </w:rPr>
               <w:t>s</w:t>
             </w:r>
@@ -2750,7 +4437,7 @@
                 <w:color w:val="000000"/>
                 <w:sz w:val="40"/>
                 <w:szCs w:val="40"/>
-                <w:lang w:eastAsia="en-IN" w:bidi="ml-IN"/>
+                <w:lang w:val="it-IT" w:eastAsia="en-IN" w:bidi="ml-IN"/>
               </w:rPr>
               <w:t xml:space="preserve">¡P¦˜ | </w:t>
             </w:r>
@@ -2761,22 +4448,22 @@
               <w:autoSpaceDE w:val="0"/>
               <w:autoSpaceDN w:val="0"/>
               <w:adjustRightInd w:val="0"/>
-              <w:spacing w:line="252" w:lineRule="auto"/>
-              <w:rPr>
-                <w:rFonts w:ascii="BRH Malayalam Extra" w:eastAsia="Times New Roman" w:hAnsi="BRH Malayalam Extra" w:cs="BRH Malayalam Extra"/>
-                <w:color w:val="000000"/>
-                <w:sz w:val="40"/>
-                <w:szCs w:val="40"/>
-                <w:lang w:eastAsia="en-IN" w:bidi="ml-IN"/>
-              </w:rPr>
-            </w:pPr>
-            <w:r>
-              <w:rPr>
-                <w:rFonts w:ascii="BRH Malayalam Extra" w:eastAsia="Times New Roman" w:hAnsi="BRH Malayalam Extra" w:cs="BRH Malayalam Extra"/>
-                <w:color w:val="000000"/>
-                <w:sz w:val="40"/>
-                <w:szCs w:val="40"/>
-                <w:lang w:eastAsia="en-IN" w:bidi="ml-IN"/>
+              <w:spacing w:before="0" w:line="240" w:lineRule="auto"/>
+              <w:rPr>
+                <w:rFonts w:ascii="BRH Malayalam Extra" w:eastAsia="Times New Roman" w:hAnsi="BRH Malayalam Extra" w:cs="BRH Malayalam Extra"/>
+                <w:color w:val="000000"/>
+                <w:sz w:val="40"/>
+                <w:szCs w:val="40"/>
+                <w:lang w:val="it-IT" w:eastAsia="en-IN" w:bidi="ml-IN"/>
+              </w:rPr>
+            </w:pPr>
+            <w:r>
+              <w:rPr>
+                <w:rFonts w:ascii="BRH Malayalam Extra" w:eastAsia="Times New Roman" w:hAnsi="BRH Malayalam Extra" w:cs="BRH Malayalam Extra"/>
+                <w:color w:val="000000"/>
+                <w:sz w:val="40"/>
+                <w:szCs w:val="40"/>
+                <w:lang w:val="it-IT" w:eastAsia="en-IN" w:bidi="ml-IN"/>
               </w:rPr>
               <w:t>ös¡Px</w:t>
             </w:r>
@@ -2786,17 +4473,17 @@
                 <w:color w:val="000000"/>
                 <w:sz w:val="32"/>
                 <w:szCs w:val="40"/>
-                <w:lang w:eastAsia="en-IN" w:bidi="ml-IN"/>
-              </w:rPr>
-              <w:t>–</w:t>
-            </w:r>
-            <w:r>
-              <w:rPr>
-                <w:rFonts w:ascii="BRH Malayalam Extra" w:eastAsia="Times New Roman" w:hAnsi="BRH Malayalam Extra" w:cs="BRH Malayalam Extra"/>
-                <w:color w:val="000000"/>
-                <w:sz w:val="40"/>
-                <w:szCs w:val="40"/>
-                <w:lang w:eastAsia="en-IN" w:bidi="ml-IN"/>
+                <w:lang w:val="it-IT" w:eastAsia="en-IN" w:bidi="ml-IN"/>
+              </w:rPr>
+              <w:t>–</w:t>
+            </w:r>
+            <w:r>
+              <w:rPr>
+                <w:rFonts w:ascii="BRH Malayalam Extra" w:eastAsia="Times New Roman" w:hAnsi="BRH Malayalam Extra" w:cs="BRH Malayalam Extra"/>
+                <w:color w:val="000000"/>
+                <w:sz w:val="40"/>
+                <w:szCs w:val="40"/>
+                <w:lang w:val="it-IT" w:eastAsia="en-IN" w:bidi="ml-IN"/>
               </w:rPr>
               <w:t>p¡e— |</w:t>
             </w:r>
@@ -2812,22 +4499,22 @@
               <w:autoSpaceDE w:val="0"/>
               <w:autoSpaceDN w:val="0"/>
               <w:adjustRightInd w:val="0"/>
-              <w:spacing w:line="252" w:lineRule="auto"/>
-              <w:rPr>
-                <w:rFonts w:ascii="BRH Malayalam Extra" w:eastAsia="Times New Roman" w:hAnsi="BRH Malayalam Extra" w:cs="BRH Malayalam Extra"/>
-                <w:color w:val="000000"/>
-                <w:sz w:val="40"/>
-                <w:szCs w:val="40"/>
-                <w:lang w:eastAsia="en-IN" w:bidi="ml-IN"/>
-              </w:rPr>
-            </w:pPr>
-            <w:r>
-              <w:rPr>
-                <w:rFonts w:ascii="BRH Malayalam Extra" w:eastAsia="Times New Roman" w:hAnsi="BRH Malayalam Extra" w:cs="BRH Malayalam Extra"/>
-                <w:color w:val="000000"/>
-                <w:sz w:val="40"/>
-                <w:szCs w:val="40"/>
-                <w:lang w:eastAsia="en-IN" w:bidi="ml-IN"/>
+              <w:spacing w:before="0" w:line="240" w:lineRule="auto"/>
+              <w:rPr>
+                <w:rFonts w:ascii="BRH Malayalam Extra" w:eastAsia="Times New Roman" w:hAnsi="BRH Malayalam Extra" w:cs="BRH Malayalam Extra"/>
+                <w:color w:val="000000"/>
+                <w:sz w:val="40"/>
+                <w:szCs w:val="40"/>
+                <w:lang w:val="it-IT" w:eastAsia="en-IN" w:bidi="ml-IN"/>
+              </w:rPr>
+            </w:pPr>
+            <w:r>
+              <w:rPr>
+                <w:rFonts w:ascii="BRH Malayalam Extra" w:eastAsia="Times New Roman" w:hAnsi="BRH Malayalam Extra" w:cs="BRH Malayalam Extra"/>
+                <w:color w:val="000000"/>
+                <w:sz w:val="40"/>
+                <w:szCs w:val="40"/>
+                <w:lang w:val="it-IT" w:eastAsia="en-IN" w:bidi="ml-IN"/>
               </w:rPr>
               <w:t>Óx</w:t>
             </w:r>
@@ -2837,17 +4524,17 @@
                 <w:color w:val="000000"/>
                 <w:sz w:val="32"/>
                 <w:szCs w:val="40"/>
-                <w:lang w:eastAsia="en-IN" w:bidi="ml-IN"/>
-              </w:rPr>
-              <w:t>–</w:t>
-            </w:r>
-            <w:r>
-              <w:rPr>
-                <w:rFonts w:ascii="BRH Malayalam Extra" w:eastAsia="Times New Roman" w:hAnsi="BRH Malayalam Extra" w:cs="BRH Malayalam Extra"/>
-                <w:color w:val="000000"/>
-                <w:sz w:val="40"/>
-                <w:szCs w:val="40"/>
-                <w:lang w:eastAsia="en-IN" w:bidi="ml-IN"/>
+                <w:lang w:val="it-IT" w:eastAsia="en-IN" w:bidi="ml-IN"/>
+              </w:rPr>
+              <w:t>–</w:t>
+            </w:r>
+            <w:r>
+              <w:rPr>
+                <w:rFonts w:ascii="BRH Malayalam Extra" w:eastAsia="Times New Roman" w:hAnsi="BRH Malayalam Extra" w:cs="BRH Malayalam Extra"/>
+                <w:color w:val="000000"/>
+                <w:sz w:val="40"/>
+                <w:szCs w:val="40"/>
+                <w:lang w:val="it-IT" w:eastAsia="en-IN" w:bidi="ml-IN"/>
               </w:rPr>
               <w:t>e</w:t>
             </w:r>
@@ -2857,17 +4544,17 @@
                 <w:color w:val="000000"/>
                 <w:sz w:val="32"/>
                 <w:szCs w:val="40"/>
-                <w:lang w:eastAsia="en-IN" w:bidi="ml-IN"/>
-              </w:rPr>
-              <w:t>–</w:t>
-            </w:r>
-            <w:r>
-              <w:rPr>
-                <w:rFonts w:ascii="BRH Malayalam Extra" w:eastAsia="Times New Roman" w:hAnsi="BRH Malayalam Extra" w:cs="BRH Malayalam Extra"/>
-                <w:color w:val="000000"/>
-                <w:sz w:val="40"/>
-                <w:szCs w:val="40"/>
-                <w:lang w:eastAsia="en-IN" w:bidi="ml-IN"/>
+                <w:lang w:val="it-IT" w:eastAsia="en-IN" w:bidi="ml-IN"/>
+              </w:rPr>
+              <w:t>–</w:t>
+            </w:r>
+            <w:r>
+              <w:rPr>
+                <w:rFonts w:ascii="BRH Malayalam Extra" w:eastAsia="Times New Roman" w:hAnsi="BRH Malayalam Extra" w:cs="BRH Malayalam Extra"/>
+                <w:color w:val="000000"/>
+                <w:sz w:val="40"/>
+                <w:szCs w:val="40"/>
+                <w:lang w:val="it-IT" w:eastAsia="en-IN" w:bidi="ml-IN"/>
               </w:rPr>
               <w:t>j</w:t>
             </w:r>
@@ -2877,17 +4564,17 @@
                 <w:color w:val="000000"/>
                 <w:sz w:val="32"/>
                 <w:szCs w:val="40"/>
-                <w:lang w:eastAsia="en-IN" w:bidi="ml-IN"/>
-              </w:rPr>
-              <w:t>–</w:t>
-            </w:r>
-            <w:r>
-              <w:rPr>
-                <w:rFonts w:ascii="BRH Malayalam Extra" w:eastAsia="Times New Roman" w:hAnsi="BRH Malayalam Extra" w:cs="BRH Malayalam Extra"/>
-                <w:color w:val="000000"/>
-                <w:sz w:val="40"/>
-                <w:szCs w:val="40"/>
-                <w:lang w:eastAsia="en-IN" w:bidi="ml-IN"/>
+                <w:lang w:val="it-IT" w:eastAsia="en-IN" w:bidi="ml-IN"/>
+              </w:rPr>
+              <w:t>–</w:t>
+            </w:r>
+            <w:r>
+              <w:rPr>
+                <w:rFonts w:ascii="BRH Malayalam Extra" w:eastAsia="Times New Roman" w:hAnsi="BRH Malayalam Extra" w:cs="BRH Malayalam Extra"/>
+                <w:color w:val="000000"/>
+                <w:sz w:val="40"/>
+                <w:szCs w:val="40"/>
+                <w:lang w:val="it-IT" w:eastAsia="en-IN" w:bidi="ml-IN"/>
               </w:rPr>
               <w:t>Zy</w:t>
             </w:r>
@@ -2897,17 +4584,17 @@
                 <w:color w:val="000000"/>
                 <w:sz w:val="32"/>
                 <w:szCs w:val="40"/>
-                <w:lang w:eastAsia="en-IN" w:bidi="ml-IN"/>
-              </w:rPr>
-              <w:t>–</w:t>
-            </w:r>
-            <w:r>
-              <w:rPr>
-                <w:rFonts w:ascii="BRH Malayalam Extra" w:eastAsia="Times New Roman" w:hAnsi="BRH Malayalam Extra" w:cs="BRH Malayalam Extra"/>
-                <w:color w:val="000000"/>
-                <w:sz w:val="40"/>
-                <w:szCs w:val="40"/>
-                <w:lang w:eastAsia="en-IN" w:bidi="ml-IN"/>
+                <w:lang w:val="it-IT" w:eastAsia="en-IN" w:bidi="ml-IN"/>
+              </w:rPr>
+              <w:t>–</w:t>
+            </w:r>
+            <w:r>
+              <w:rPr>
+                <w:rFonts w:ascii="BRH Malayalam Extra" w:eastAsia="Times New Roman" w:hAnsi="BRH Malayalam Extra" w:cs="BRH Malayalam Extra"/>
+                <w:color w:val="000000"/>
+                <w:sz w:val="40"/>
+                <w:szCs w:val="40"/>
+                <w:lang w:val="it-IT" w:eastAsia="en-IN" w:bidi="ml-IN"/>
               </w:rPr>
               <w:t xml:space="preserve"> </w:t>
             </w:r>
@@ -2918,7 +4605,7 @@
                 <w:sz w:val="40"/>
                 <w:szCs w:val="40"/>
                 <w:highlight w:val="green"/>
-                <w:lang w:eastAsia="en-IN" w:bidi="ml-IN"/>
+                <w:lang w:val="it-IT" w:eastAsia="en-IN" w:bidi="ml-IN"/>
               </w:rPr>
               <w:t>ö</w:t>
             </w:r>
@@ -2928,7 +4615,7 @@
                 <w:color w:val="000000"/>
                 <w:sz w:val="40"/>
                 <w:szCs w:val="40"/>
-                <w:lang w:eastAsia="en-IN" w:bidi="ml-IN"/>
+                <w:lang w:val="it-IT" w:eastAsia="en-IN" w:bidi="ml-IN"/>
               </w:rPr>
               <w:t xml:space="preserve">s¡P¦˜ | </w:t>
             </w:r>
@@ -2939,7 +4626,7 @@
               <w:autoSpaceDE w:val="0"/>
               <w:autoSpaceDN w:val="0"/>
               <w:adjustRightInd w:val="0"/>
-              <w:spacing w:line="252" w:lineRule="auto"/>
+              <w:spacing w:before="0" w:line="240" w:lineRule="auto"/>
               <w:rPr>
                 <w:rFonts w:ascii="BRH Malayalam Extra" w:eastAsia="Times New Roman" w:hAnsi="BRH Malayalam Extra" w:cs="BRH Malayalam Extra"/>
                 <w:color w:val="000000"/>
@@ -2998,7 +4685,7 @@
               <w:autoSpaceDE w:val="0"/>
               <w:autoSpaceDN w:val="0"/>
               <w:adjustRightInd w:val="0"/>
-              <w:spacing w:before="0" w:line="252" w:lineRule="auto"/>
+              <w:spacing w:before="0" w:line="240" w:lineRule="auto"/>
               <w:ind w:right="297"/>
               <w:rPr>
                 <w:rFonts w:cs="Arial"/>
@@ -3023,16 +4710,7 @@
                 <w:sz w:val="28"/>
                 <w:szCs w:val="32"/>
               </w:rPr>
-              <w:t>8</w:t>
-            </w:r>
-            <w:r>
-              <w:rPr>
-                <w:rFonts w:cs="Arial"/>
-                <w:b/>
-                <w:sz w:val="28"/>
-                <w:szCs w:val="32"/>
-              </w:rPr>
-              <w:t>.3</w:t>
+              <w:t>8.3</w:t>
             </w:r>
             <w:r>
               <w:rPr>
@@ -3053,35 +4731,25 @@
               <w:autoSpaceDE w:val="0"/>
               <w:autoSpaceDN w:val="0"/>
               <w:adjustRightInd w:val="0"/>
-              <w:spacing w:before="0" w:line="252" w:lineRule="auto"/>
+              <w:spacing w:before="0" w:line="240" w:lineRule="auto"/>
               <w:ind w:right="297"/>
               <w:rPr>
                 <w:rFonts w:cs="Arial"/>
                 <w:b/>
                 <w:sz w:val="28"/>
                 <w:szCs w:val="32"/>
-                <w:lang w:val="it-IT"/>
-              </w:rPr>
-            </w:pPr>
-            <w:r>
-              <w:rPr>
-                <w:rFonts w:cs="Arial"/>
-                <w:b/>
-                <w:sz w:val="28"/>
-                <w:szCs w:val="32"/>
-                <w:lang w:val="it-IT"/>
-              </w:rPr>
-              <w:t xml:space="preserve">Krama Vaakyam No.– </w:t>
-            </w:r>
-            <w:r>
-              <w:rPr>
-                <w:rFonts w:cs="Arial"/>
-                <w:b/>
-                <w:sz w:val="28"/>
-                <w:szCs w:val="32"/>
-                <w:lang w:val="it-IT"/>
-              </w:rPr>
-              <w:t>55</w:t>
+                <w:lang w:val="en-IN"/>
+              </w:rPr>
+            </w:pPr>
+            <w:r>
+              <w:rPr>
+                <w:rFonts w:cs="Arial"/>
+                <w:b/>
+                <w:sz w:val="28"/>
+                <w:szCs w:val="32"/>
+                <w:lang w:val="en-IN"/>
+              </w:rPr>
+              <w:t>Krama Vaakyam No.– 55</w:t>
             </w:r>
           </w:p>
           <w:p>
@@ -3093,7 +4761,7 @@
               <w:autoSpaceDE w:val="0"/>
               <w:autoSpaceDN w:val="0"/>
               <w:adjustRightInd w:val="0"/>
-              <w:spacing w:before="0" w:line="252" w:lineRule="auto"/>
+              <w:spacing w:before="0" w:line="240" w:lineRule="auto"/>
               <w:ind w:right="297"/>
               <w:rPr>
                 <w:rFonts w:cs="Arial"/>
@@ -3144,22 +4812,22 @@
               <w:autoSpaceDE w:val="0"/>
               <w:autoSpaceDN w:val="0"/>
               <w:adjustRightInd w:val="0"/>
-              <w:spacing w:line="252" w:lineRule="auto"/>
-              <w:rPr>
-                <w:rFonts w:ascii="BRH Malayalam Extra" w:eastAsia="Times New Roman" w:hAnsi="BRH Malayalam Extra" w:cs="BRH Malayalam Extra"/>
-                <w:color w:val="000000"/>
-                <w:sz w:val="40"/>
-                <w:szCs w:val="40"/>
-                <w:lang w:eastAsia="en-IN" w:bidi="ml-IN"/>
-              </w:rPr>
-            </w:pPr>
-            <w:r>
-              <w:rPr>
-                <w:rFonts w:ascii="BRH Malayalam Extra" w:eastAsia="Times New Roman" w:hAnsi="BRH Malayalam Extra" w:cs="BRH Malayalam Extra"/>
-                <w:color w:val="000000"/>
-                <w:sz w:val="40"/>
-                <w:szCs w:val="40"/>
-                <w:lang w:eastAsia="en-IN" w:bidi="ml-IN"/>
+              <w:spacing w:before="0" w:line="240" w:lineRule="auto"/>
+              <w:rPr>
+                <w:rFonts w:ascii="BRH Malayalam Extra" w:eastAsia="Times New Roman" w:hAnsi="BRH Malayalam Extra" w:cs="BRH Malayalam Extra"/>
+                <w:color w:val="000000"/>
+                <w:sz w:val="40"/>
+                <w:szCs w:val="40"/>
+                <w:lang w:val="it-IT" w:eastAsia="en-IN" w:bidi="ml-IN"/>
+              </w:rPr>
+            </w:pPr>
+            <w:r>
+              <w:rPr>
+                <w:rFonts w:ascii="BRH Malayalam Extra" w:eastAsia="Times New Roman" w:hAnsi="BRH Malayalam Extra" w:cs="BRH Malayalam Extra"/>
+                <w:color w:val="000000"/>
+                <w:sz w:val="40"/>
+                <w:szCs w:val="40"/>
+                <w:lang w:val="it-IT" w:eastAsia="en-IN" w:bidi="ml-IN"/>
               </w:rPr>
               <w:t>DÀ—km±§ixYI ¥b</w:t>
             </w:r>
@@ -3169,17 +4837,17 @@
                 <w:color w:val="000000"/>
                 <w:sz w:val="32"/>
                 <w:szCs w:val="40"/>
-                <w:lang w:eastAsia="en-IN" w:bidi="ml-IN"/>
-              </w:rPr>
-              <w:t>–</w:t>
-            </w:r>
-            <w:r>
-              <w:rPr>
-                <w:rFonts w:ascii="BRH Malayalam Extra" w:eastAsia="Times New Roman" w:hAnsi="BRH Malayalam Extra" w:cs="BRH Malayalam Extra"/>
-                <w:color w:val="000000"/>
-                <w:sz w:val="40"/>
-                <w:szCs w:val="40"/>
-                <w:lang w:eastAsia="en-IN" w:bidi="ml-IN"/>
+                <w:lang w:val="it-IT" w:eastAsia="en-IN" w:bidi="ml-IN"/>
+              </w:rPr>
+              <w:t>–</w:t>
+            </w:r>
+            <w:r>
+              <w:rPr>
+                <w:rFonts w:ascii="BRH Malayalam Extra" w:eastAsia="Times New Roman" w:hAnsi="BRH Malayalam Extra" w:cs="BRH Malayalam Extra"/>
+                <w:color w:val="000000"/>
+                <w:sz w:val="40"/>
+                <w:szCs w:val="40"/>
+                <w:lang w:val="it-IT" w:eastAsia="en-IN" w:bidi="ml-IN"/>
               </w:rPr>
               <w:t xml:space="preserve">pxJ | </w:t>
             </w:r>
@@ -3190,7 +4858,7 @@
               <w:autoSpaceDE w:val="0"/>
               <w:autoSpaceDN w:val="0"/>
               <w:adjustRightInd w:val="0"/>
-              <w:spacing w:line="252" w:lineRule="auto"/>
+              <w:spacing w:before="0" w:line="240" w:lineRule="auto"/>
               <w:rPr>
                 <w:rFonts w:ascii="BRH Malayalam Extra" w:eastAsia="Times New Roman" w:hAnsi="BRH Malayalam Extra" w:cs="BRH Malayalam Extra"/>
                 <w:color w:val="000000"/>
@@ -3322,7 +4990,7 @@
               <w:autoSpaceDE w:val="0"/>
               <w:autoSpaceDN w:val="0"/>
               <w:adjustRightInd w:val="0"/>
-              <w:spacing w:line="252" w:lineRule="auto"/>
+              <w:spacing w:before="0" w:line="240" w:lineRule="auto"/>
               <w:rPr>
                 <w:rFonts w:ascii="BRH Malayalam Extra" w:eastAsia="Times New Roman" w:hAnsi="BRH Malayalam Extra" w:cs="BRH Malayalam Extra"/>
                 <w:color w:val="000000"/>
@@ -3368,7 +5036,7 @@
               <w:autoSpaceDE w:val="0"/>
               <w:autoSpaceDN w:val="0"/>
               <w:adjustRightInd w:val="0"/>
-              <w:spacing w:line="252" w:lineRule="auto"/>
+              <w:spacing w:before="0" w:line="240" w:lineRule="auto"/>
               <w:rPr>
                 <w:rFonts w:ascii="BRH Malayalam Extra" w:eastAsia="Times New Roman" w:hAnsi="BRH Malayalam Extra" w:cs="BRH Malayalam Extra"/>
                 <w:color w:val="000000"/>
@@ -3435,7 +5103,7 @@
               <w:autoSpaceDE w:val="0"/>
               <w:autoSpaceDN w:val="0"/>
               <w:adjustRightInd w:val="0"/>
-              <w:spacing w:line="252" w:lineRule="auto"/>
+              <w:spacing w:before="0" w:line="240" w:lineRule="auto"/>
               <w:rPr>
                 <w:rFonts w:ascii="BRH Malayalam Extra" w:eastAsia="Times New Roman" w:hAnsi="BRH Malayalam Extra" w:cs="BRH Malayalam Extra"/>
                 <w:color w:val="000000"/>
@@ -3513,6 +5181,1111 @@
                 <w:lang w:val="it-IT" w:eastAsia="en-IN" w:bidi="ml-IN"/>
               </w:rPr>
               <w:t>I |</w:t>
+            </w:r>
+          </w:p>
+        </w:tc>
+      </w:tr>
+      <w:tr>
+        <w:trPr>
+          <w:trHeight w:val="1154"/>
+        </w:trPr>
+        <w:tc>
+          <w:tcPr>
+            <w:tcW w:w="3906" w:type="dxa"/>
+          </w:tcPr>
+          <w:p>
+            <w:pPr>
+              <w:widowControl w:val="0"/>
+              <w:tabs>
+                <w:tab w:val="left" w:pos="993"/>
+              </w:tabs>
+              <w:autoSpaceDE w:val="0"/>
+              <w:autoSpaceDN w:val="0"/>
+              <w:adjustRightInd w:val="0"/>
+              <w:spacing w:before="0" w:line="240" w:lineRule="auto"/>
+              <w:ind w:right="297"/>
+              <w:rPr>
+                <w:rFonts w:cs="Arial"/>
+                <w:b/>
+                <w:sz w:val="28"/>
+                <w:szCs w:val="32"/>
+              </w:rPr>
+            </w:pPr>
+            <w:r>
+              <w:rPr>
+                <w:rFonts w:cs="Arial"/>
+                <w:b/>
+                <w:sz w:val="28"/>
+                <w:szCs w:val="32"/>
+              </w:rPr>
+              <w:lastRenderedPageBreak/>
+              <w:t>T.S.5.2.</w:t>
+            </w:r>
+            <w:r>
+              <w:rPr>
+                <w:rFonts w:cs="Arial"/>
+                <w:b/>
+                <w:sz w:val="28"/>
+                <w:szCs w:val="32"/>
+              </w:rPr>
+              <w:t>8.6</w:t>
+            </w:r>
+            <w:r>
+              <w:rPr>
+                <w:rFonts w:cs="Arial"/>
+                <w:b/>
+                <w:sz w:val="28"/>
+                <w:szCs w:val="32"/>
+              </w:rPr>
+              <w:t xml:space="preserve"> – Kramam</w:t>
+            </w:r>
+          </w:p>
+          <w:p>
+            <w:pPr>
+              <w:widowControl w:val="0"/>
+              <w:tabs>
+                <w:tab w:val="left" w:pos="993"/>
+              </w:tabs>
+              <w:autoSpaceDE w:val="0"/>
+              <w:autoSpaceDN w:val="0"/>
+              <w:adjustRightInd w:val="0"/>
+              <w:spacing w:before="0" w:line="240" w:lineRule="auto"/>
+              <w:ind w:right="297"/>
+              <w:rPr>
+                <w:rFonts w:cs="Arial"/>
+                <w:b/>
+                <w:sz w:val="28"/>
+                <w:szCs w:val="32"/>
+                <w:lang w:val="en-IN"/>
+              </w:rPr>
+            </w:pPr>
+            <w:r>
+              <w:rPr>
+                <w:rFonts w:cs="Arial"/>
+                <w:b/>
+                <w:sz w:val="28"/>
+                <w:szCs w:val="32"/>
+                <w:lang w:val="en-IN"/>
+              </w:rPr>
+              <w:t xml:space="preserve">Krama Vaakyam No.– </w:t>
+            </w:r>
+            <w:r>
+              <w:rPr>
+                <w:rFonts w:cs="Arial"/>
+                <w:b/>
+                <w:sz w:val="28"/>
+                <w:szCs w:val="32"/>
+                <w:lang w:val="en-IN"/>
+              </w:rPr>
+              <w:t>19</w:t>
+            </w:r>
+          </w:p>
+          <w:p>
+            <w:pPr>
+              <w:widowControl w:val="0"/>
+              <w:tabs>
+                <w:tab w:val="left" w:pos="993"/>
+              </w:tabs>
+              <w:autoSpaceDE w:val="0"/>
+              <w:autoSpaceDN w:val="0"/>
+              <w:adjustRightInd w:val="0"/>
+              <w:spacing w:before="0" w:line="240" w:lineRule="auto"/>
+              <w:ind w:right="297"/>
+              <w:rPr>
+                <w:rFonts w:cs="Arial"/>
+                <w:b/>
+                <w:sz w:val="28"/>
+                <w:szCs w:val="32"/>
+                <w:lang w:val="it-IT"/>
+              </w:rPr>
+            </w:pPr>
+            <w:r>
+              <w:rPr>
+                <w:rFonts w:cs="Arial"/>
+                <w:b/>
+                <w:sz w:val="28"/>
+                <w:szCs w:val="32"/>
+                <w:lang w:val="it-IT"/>
+              </w:rPr>
+              <w:t>Panchaati No</w:t>
+            </w:r>
+            <w:r>
+              <w:rPr>
+                <w:rFonts w:cs="Arial"/>
+                <w:b/>
+                <w:szCs w:val="32"/>
+                <w:lang w:val="it-IT"/>
+              </w:rPr>
+              <w:t xml:space="preserve">. - </w:t>
+            </w:r>
+            <w:r>
+              <w:rPr>
+                <w:rFonts w:cs="Arial"/>
+                <w:b/>
+                <w:sz w:val="28"/>
+                <w:szCs w:val="32"/>
+                <w:lang w:val="it-IT"/>
+              </w:rPr>
+              <w:t>46</w:t>
+            </w:r>
+          </w:p>
+        </w:tc>
+        <w:tc>
+          <w:tcPr>
+            <w:tcW w:w="5103" w:type="dxa"/>
+          </w:tcPr>
+          <w:p>
+            <w:pPr>
+              <w:widowControl w:val="0"/>
+              <w:autoSpaceDE w:val="0"/>
+              <w:autoSpaceDN w:val="0"/>
+              <w:adjustRightInd w:val="0"/>
+              <w:spacing w:before="0" w:line="240" w:lineRule="auto"/>
+              <w:rPr>
+                <w:rFonts w:ascii="BRH Devanagari Extra" w:hAnsi="BRH Devanagari Extra" w:cs="BRH Devanagari Extra"/>
+                <w:color w:val="000000"/>
+                <w:sz w:val="40"/>
+                <w:szCs w:val="40"/>
+                <w:lang w:val="it-IT"/>
+              </w:rPr>
+            </w:pPr>
+            <w:r>
+              <w:rPr>
+                <w:rFonts w:ascii="BRH Malayalam Extra" w:eastAsia="Times New Roman" w:hAnsi="BRH Malayalam Extra" w:cs="BRH Malayalam Extra"/>
+                <w:color w:val="000000"/>
+                <w:sz w:val="40"/>
+                <w:szCs w:val="40"/>
+                <w:lang w:val="it-IT" w:eastAsia="en-IN" w:bidi="ml-IN"/>
+              </w:rPr>
+              <w:t xml:space="preserve">jb§ </w:t>
+            </w:r>
+            <w:r>
+              <w:rPr>
+                <w:rFonts w:ascii="BRH Malayalam Extra" w:eastAsia="Times New Roman" w:hAnsi="BRH Malayalam Extra" w:cs="BRH Malayalam Extra"/>
+                <w:color w:val="000000"/>
+                <w:sz w:val="40"/>
+                <w:szCs w:val="40"/>
+                <w:highlight w:val="yellow"/>
+                <w:lang w:val="it-IT" w:eastAsia="en-IN" w:bidi="ml-IN"/>
+              </w:rPr>
+              <w:t>bb</w:t>
+            </w:r>
+            <w:r>
+              <w:rPr>
+                <w:rFonts w:ascii="BRH Malayalam Extra" w:eastAsia="Times New Roman" w:hAnsi="BRH Malayalam Extra" w:cs="BRH Malayalam Extra"/>
+                <w:color w:val="000000"/>
+                <w:sz w:val="40"/>
+                <w:szCs w:val="40"/>
+                <w:lang w:val="it-IT" w:eastAsia="en-IN" w:bidi="ml-IN"/>
+              </w:rPr>
+              <w:t>§cy— | bÆõx—k</w:t>
+            </w:r>
+            <w:r>
+              <w:rPr>
+                <w:rFonts w:ascii="BRH Malayalam Extra" w:eastAsia="Times New Roman" w:hAnsi="BRH Malayalam Extra" w:cs="BRH Malayalam Extra"/>
+                <w:color w:val="000000"/>
+                <w:sz w:val="32"/>
+                <w:szCs w:val="40"/>
+                <w:lang w:val="it-IT" w:eastAsia="en-IN" w:bidi="ml-IN"/>
+              </w:rPr>
+              <w:t>–</w:t>
+            </w:r>
+            <w:r>
+              <w:rPr>
+                <w:rFonts w:ascii="BRH Malayalam Extra" w:eastAsia="Times New Roman" w:hAnsi="BRH Malayalam Extra" w:cs="BRH Malayalam Extra"/>
+                <w:color w:val="000000"/>
+                <w:sz w:val="40"/>
+                <w:szCs w:val="40"/>
+                <w:lang w:val="it-IT" w:eastAsia="en-IN" w:bidi="ml-IN"/>
+              </w:rPr>
+              <w:t>YõI |</w:t>
+            </w:r>
+          </w:p>
+        </w:tc>
+        <w:tc>
+          <w:tcPr>
+            <w:tcW w:w="5386" w:type="dxa"/>
+          </w:tcPr>
+          <w:p>
+            <w:pPr>
+              <w:widowControl w:val="0"/>
+              <w:autoSpaceDE w:val="0"/>
+              <w:autoSpaceDN w:val="0"/>
+              <w:adjustRightInd w:val="0"/>
+              <w:spacing w:before="0" w:line="240" w:lineRule="auto"/>
+              <w:rPr>
+                <w:rFonts w:ascii="BRH Devanagari Extra" w:hAnsi="BRH Devanagari Extra" w:cs="BRH Devanagari Extra"/>
+                <w:color w:val="000000"/>
+                <w:sz w:val="40"/>
+                <w:szCs w:val="40"/>
+                <w:lang w:val="it-IT"/>
+              </w:rPr>
+            </w:pPr>
+            <w:r>
+              <w:rPr>
+                <w:rFonts w:ascii="BRH Malayalam Extra" w:eastAsia="Times New Roman" w:hAnsi="BRH Malayalam Extra" w:cs="BRH Malayalam Extra"/>
+                <w:color w:val="000000"/>
+                <w:sz w:val="40"/>
+                <w:szCs w:val="40"/>
+                <w:lang w:val="it-IT" w:eastAsia="en-IN" w:bidi="ml-IN"/>
+              </w:rPr>
+              <w:t xml:space="preserve">jb§ </w:t>
+            </w:r>
+            <w:r>
+              <w:rPr>
+                <w:rFonts w:ascii="BRH Malayalam Extra" w:eastAsia="Times New Roman" w:hAnsi="BRH Malayalam Extra" w:cs="BRH Malayalam Extra"/>
+                <w:color w:val="000000"/>
+                <w:sz w:val="40"/>
+                <w:szCs w:val="40"/>
+                <w:highlight w:val="green"/>
+                <w:lang w:val="it-IT" w:eastAsia="en-IN" w:bidi="ml-IN"/>
+              </w:rPr>
+              <w:t>b</w:t>
+            </w:r>
+            <w:r>
+              <w:rPr>
+                <w:rFonts w:ascii="BRH Malayalam Extra" w:eastAsia="Times New Roman" w:hAnsi="BRH Malayalam Extra" w:cs="BRH Malayalam Extra"/>
+                <w:color w:val="000000"/>
+                <w:sz w:val="40"/>
+                <w:szCs w:val="40"/>
+                <w:lang w:val="it-IT" w:eastAsia="en-IN" w:bidi="ml-IN"/>
+              </w:rPr>
+              <w:t>cy— | bÆõx—k</w:t>
+            </w:r>
+            <w:r>
+              <w:rPr>
+                <w:rFonts w:ascii="BRH Malayalam Extra" w:eastAsia="Times New Roman" w:hAnsi="BRH Malayalam Extra" w:cs="BRH Malayalam Extra"/>
+                <w:color w:val="000000"/>
+                <w:sz w:val="32"/>
+                <w:szCs w:val="40"/>
+                <w:lang w:val="it-IT" w:eastAsia="en-IN" w:bidi="ml-IN"/>
+              </w:rPr>
+              <w:t>–</w:t>
+            </w:r>
+            <w:r>
+              <w:rPr>
+                <w:rFonts w:ascii="BRH Malayalam Extra" w:eastAsia="Times New Roman" w:hAnsi="BRH Malayalam Extra" w:cs="BRH Malayalam Extra"/>
+                <w:color w:val="000000"/>
+                <w:sz w:val="40"/>
+                <w:szCs w:val="40"/>
+                <w:lang w:val="it-IT" w:eastAsia="en-IN" w:bidi="ml-IN"/>
+              </w:rPr>
+              <w:t>YõI |</w:t>
+            </w:r>
+          </w:p>
+        </w:tc>
+      </w:tr>
+      <w:tr>
+        <w:trPr>
+          <w:trHeight w:val="2218"/>
+        </w:trPr>
+        <w:tc>
+          <w:tcPr>
+            <w:tcW w:w="3906" w:type="dxa"/>
+          </w:tcPr>
+          <w:p>
+            <w:pPr>
+              <w:widowControl w:val="0"/>
+              <w:tabs>
+                <w:tab w:val="left" w:pos="993"/>
+              </w:tabs>
+              <w:autoSpaceDE w:val="0"/>
+              <w:autoSpaceDN w:val="0"/>
+              <w:adjustRightInd w:val="0"/>
+              <w:spacing w:before="0" w:line="240" w:lineRule="auto"/>
+              <w:ind w:right="297"/>
+              <w:rPr>
+                <w:rFonts w:cs="Arial"/>
+                <w:b/>
+                <w:sz w:val="28"/>
+                <w:szCs w:val="28"/>
+              </w:rPr>
+            </w:pPr>
+            <w:r>
+              <w:rPr>
+                <w:rFonts w:cs="Arial"/>
+                <w:b/>
+                <w:sz w:val="28"/>
+                <w:szCs w:val="28"/>
+              </w:rPr>
+              <w:t>T.S.5.2.10.6 – Kramam</w:t>
+            </w:r>
+          </w:p>
+          <w:p>
+            <w:pPr>
+              <w:widowControl w:val="0"/>
+              <w:tabs>
+                <w:tab w:val="left" w:pos="993"/>
+              </w:tabs>
+              <w:autoSpaceDE w:val="0"/>
+              <w:autoSpaceDN w:val="0"/>
+              <w:adjustRightInd w:val="0"/>
+              <w:spacing w:before="0" w:line="240" w:lineRule="auto"/>
+              <w:ind w:right="297"/>
+              <w:rPr>
+                <w:rFonts w:cs="Arial"/>
+                <w:b/>
+                <w:sz w:val="28"/>
+                <w:szCs w:val="28"/>
+                <w:lang w:val="en-IN"/>
+              </w:rPr>
+            </w:pPr>
+            <w:r>
+              <w:rPr>
+                <w:rFonts w:cs="Arial"/>
+                <w:b/>
+                <w:sz w:val="28"/>
+                <w:szCs w:val="28"/>
+                <w:lang w:val="en-IN"/>
+              </w:rPr>
+              <w:t xml:space="preserve">Krama Vaakyam No.– </w:t>
+            </w:r>
+            <w:r>
+              <w:rPr>
+                <w:rFonts w:cs="Arial"/>
+                <w:b/>
+                <w:sz w:val="28"/>
+                <w:szCs w:val="28"/>
+                <w:lang w:val="en-IN"/>
+              </w:rPr>
+              <w:t>38,40,41</w:t>
+            </w:r>
+          </w:p>
+          <w:p>
+            <w:pPr>
+              <w:widowControl w:val="0"/>
+              <w:tabs>
+                <w:tab w:val="left" w:pos="993"/>
+              </w:tabs>
+              <w:autoSpaceDE w:val="0"/>
+              <w:autoSpaceDN w:val="0"/>
+              <w:adjustRightInd w:val="0"/>
+              <w:spacing w:before="0" w:line="240" w:lineRule="auto"/>
+              <w:ind w:right="297"/>
+              <w:rPr>
+                <w:rFonts w:cs="Arial"/>
+                <w:b/>
+                <w:sz w:val="28"/>
+                <w:szCs w:val="32"/>
+              </w:rPr>
+            </w:pPr>
+            <w:r>
+              <w:rPr>
+                <w:rFonts w:cs="Arial"/>
+                <w:b/>
+                <w:sz w:val="28"/>
+                <w:szCs w:val="28"/>
+                <w:lang w:val="it-IT"/>
+              </w:rPr>
+              <w:t>Panchaati No. - 59</w:t>
+            </w:r>
+          </w:p>
+        </w:tc>
+        <w:tc>
+          <w:tcPr>
+            <w:tcW w:w="5103" w:type="dxa"/>
+          </w:tcPr>
+          <w:p>
+            <w:pPr>
+              <w:widowControl w:val="0"/>
+              <w:autoSpaceDE w:val="0"/>
+              <w:autoSpaceDN w:val="0"/>
+              <w:adjustRightInd w:val="0"/>
+              <w:spacing w:before="0" w:line="240" w:lineRule="auto"/>
+              <w:rPr>
+                <w:rFonts w:ascii="BRH Malayalam Extra" w:eastAsia="Times New Roman" w:hAnsi="BRH Malayalam Extra" w:cs="BRH Malayalam Extra"/>
+                <w:color w:val="000000"/>
+                <w:sz w:val="40"/>
+                <w:szCs w:val="40"/>
+                <w:lang w:eastAsia="en-IN" w:bidi="ml-IN"/>
+              </w:rPr>
+            </w:pPr>
+            <w:r>
+              <w:rPr>
+                <w:rFonts w:ascii="BRH Malayalam Extra" w:eastAsia="Times New Roman" w:hAnsi="BRH Malayalam Extra" w:cs="BRH Malayalam Extra"/>
+                <w:color w:val="000000"/>
+                <w:sz w:val="40"/>
+                <w:szCs w:val="40"/>
+                <w:lang w:eastAsia="en-IN" w:bidi="ml-IN"/>
+              </w:rPr>
+              <w:t>s</w:t>
+            </w:r>
+            <w:r>
+              <w:rPr>
+                <w:rFonts w:ascii="BRH Malayalam Extra" w:eastAsia="Times New Roman" w:hAnsi="BRH Malayalam Extra" w:cs="BRH Malayalam Extra"/>
+                <w:color w:val="000000"/>
+                <w:sz w:val="32"/>
+                <w:szCs w:val="40"/>
+                <w:lang w:eastAsia="en-IN" w:bidi="ml-IN"/>
+              </w:rPr>
+              <w:t>–</w:t>
+            </w:r>
+            <w:r>
+              <w:rPr>
+                <w:rFonts w:ascii="BRH Malayalam Extra" w:eastAsia="Times New Roman" w:hAnsi="BRH Malayalam Extra" w:cs="BRH Malayalam Extra"/>
+                <w:color w:val="000000"/>
+                <w:sz w:val="40"/>
+                <w:szCs w:val="40"/>
+                <w:lang w:eastAsia="en-IN" w:bidi="ml-IN"/>
+              </w:rPr>
+              <w:t>I</w:t>
+            </w:r>
+            <w:r>
+              <w:rPr>
+                <w:rFonts w:ascii="BRH Devanagari Extra" w:eastAsia="Times New Roman" w:hAnsi="BRH Devanagari Extra" w:cs="BRH Malayalam Extra"/>
+                <w:color w:val="000000"/>
+                <w:sz w:val="32"/>
+                <w:szCs w:val="40"/>
+                <w:lang w:eastAsia="en-IN" w:bidi="ml-IN"/>
+              </w:rPr>
+              <w:t>Æ</w:t>
+            </w:r>
+            <w:r>
+              <w:rPr>
+                <w:rFonts w:ascii="BRH Malayalam Extra" w:eastAsia="Times New Roman" w:hAnsi="BRH Malayalam Extra" w:cs="BRH Malayalam Extra"/>
+                <w:color w:val="000000"/>
+                <w:sz w:val="40"/>
+                <w:szCs w:val="40"/>
+                <w:lang w:eastAsia="en-IN" w:bidi="ml-IN"/>
+              </w:rPr>
+              <w:t>jZx</w:t>
+            </w:r>
+            <w:r>
+              <w:rPr>
+                <w:rFonts w:ascii="BRH Devanagari Extra" w:eastAsia="Times New Roman" w:hAnsi="BRH Devanagari Extra" w:cs="BRH Malayalam Extra"/>
+                <w:color w:val="000000"/>
+                <w:sz w:val="36"/>
+                <w:szCs w:val="40"/>
+                <w:lang w:eastAsia="en-IN" w:bidi="ml-IN"/>
+              </w:rPr>
+              <w:t>óè</w:t>
+            </w:r>
+            <w:r>
+              <w:rPr>
+                <w:rFonts w:ascii="BRH Malayalam Extra" w:eastAsia="Times New Roman" w:hAnsi="BRH Malayalam Extra" w:cs="BRH Malayalam Extra"/>
+                <w:color w:val="000000"/>
+                <w:sz w:val="40"/>
+                <w:szCs w:val="40"/>
+                <w:lang w:eastAsia="en-IN" w:bidi="ml-IN"/>
+              </w:rPr>
+              <w:t>— sI</w:t>
+            </w:r>
+            <w:r>
+              <w:rPr>
+                <w:rFonts w:ascii="BRH Devanagari Extra" w:eastAsia="Times New Roman" w:hAnsi="BRH Devanagari Extra" w:cs="BRH Malayalam Extra"/>
+                <w:color w:val="000000"/>
+                <w:sz w:val="32"/>
+                <w:szCs w:val="40"/>
+                <w:lang w:eastAsia="en-IN" w:bidi="ml-IN"/>
+              </w:rPr>
+              <w:t>Æ</w:t>
+            </w:r>
+            <w:r>
+              <w:rPr>
+                <w:rFonts w:ascii="BRH Malayalam Extra" w:eastAsia="Times New Roman" w:hAnsi="BRH Malayalam Extra" w:cs="BRH Malayalam Extra"/>
+                <w:color w:val="000000"/>
+                <w:sz w:val="40"/>
+                <w:szCs w:val="40"/>
+                <w:lang w:eastAsia="en-IN" w:bidi="ml-IN"/>
+              </w:rPr>
+              <w:t>j</w:t>
+            </w:r>
+            <w:r>
+              <w:rPr>
+                <w:rFonts w:ascii="BRH Malayalam Extra" w:eastAsia="Times New Roman" w:hAnsi="BRH Malayalam Extra" w:cs="BRH Malayalam Extra"/>
+                <w:color w:val="000000"/>
+                <w:sz w:val="32"/>
+                <w:szCs w:val="40"/>
+                <w:lang w:eastAsia="en-IN" w:bidi="ml-IN"/>
+              </w:rPr>
+              <w:t>–</w:t>
+            </w:r>
+            <w:r>
+              <w:rPr>
+                <w:rFonts w:ascii="BRH Malayalam Extra" w:eastAsia="Times New Roman" w:hAnsi="BRH Malayalam Extra" w:cs="BRH Malayalam Extra"/>
+                <w:color w:val="000000"/>
+                <w:sz w:val="40"/>
+                <w:szCs w:val="40"/>
+                <w:highlight w:val="yellow"/>
+                <w:lang w:eastAsia="en-IN" w:bidi="ml-IN"/>
+              </w:rPr>
+              <w:t>Z</w:t>
+            </w:r>
+            <w:r>
+              <w:rPr>
+                <w:rFonts w:ascii="BRH Malayalam Extra" w:eastAsia="Times New Roman" w:hAnsi="BRH Malayalam Extra" w:cs="BRH Malayalam Extra"/>
+                <w:color w:val="000000"/>
+                <w:sz w:val="40"/>
+                <w:szCs w:val="40"/>
+                <w:lang w:eastAsia="en-IN" w:bidi="ml-IN"/>
+              </w:rPr>
+              <w:t xml:space="preserve">ûI | </w:t>
+            </w:r>
+          </w:p>
+          <w:p>
+            <w:pPr>
+              <w:widowControl w:val="0"/>
+              <w:autoSpaceDE w:val="0"/>
+              <w:autoSpaceDN w:val="0"/>
+              <w:adjustRightInd w:val="0"/>
+              <w:spacing w:before="0" w:line="240" w:lineRule="auto"/>
+              <w:rPr>
+                <w:rFonts w:ascii="BRH Malayalam Extra" w:eastAsia="Times New Roman" w:hAnsi="BRH Malayalam Extra" w:cs="BRH Malayalam Extra"/>
+                <w:color w:val="000000"/>
+                <w:sz w:val="40"/>
+                <w:szCs w:val="40"/>
+                <w:lang w:eastAsia="en-IN" w:bidi="ml-IN"/>
+              </w:rPr>
+            </w:pPr>
+            <w:r>
+              <w:rPr>
+                <w:rFonts w:ascii="BRH Malayalam Extra" w:eastAsia="Times New Roman" w:hAnsi="BRH Malayalam Extra" w:cs="BRH Malayalam Extra"/>
+                <w:color w:val="000000"/>
+                <w:sz w:val="40"/>
+                <w:szCs w:val="40"/>
+                <w:lang w:eastAsia="en-IN" w:bidi="ml-IN"/>
+              </w:rPr>
+              <w:t xml:space="preserve"> s</w:t>
+            </w:r>
+            <w:r>
+              <w:rPr>
+                <w:rFonts w:ascii="BRH Malayalam Extra" w:eastAsia="Times New Roman" w:hAnsi="BRH Malayalam Extra" w:cs="BRH Malayalam Extra"/>
+                <w:color w:val="000000"/>
+                <w:sz w:val="32"/>
+                <w:szCs w:val="40"/>
+                <w:lang w:eastAsia="en-IN" w:bidi="ml-IN"/>
+              </w:rPr>
+              <w:t>–</w:t>
+            </w:r>
+            <w:r>
+              <w:rPr>
+                <w:rFonts w:ascii="BRH Malayalam Extra" w:eastAsia="Times New Roman" w:hAnsi="BRH Malayalam Extra" w:cs="BRH Malayalam Extra"/>
+                <w:color w:val="000000"/>
+                <w:sz w:val="40"/>
+                <w:szCs w:val="40"/>
+                <w:lang w:eastAsia="en-IN" w:bidi="ml-IN"/>
+              </w:rPr>
+              <w:t>I</w:t>
+            </w:r>
+            <w:r>
+              <w:rPr>
+                <w:rFonts w:ascii="BRH Devanagari Extra" w:eastAsia="Times New Roman" w:hAnsi="BRH Devanagari Extra" w:cs="BRH Malayalam Extra"/>
+                <w:color w:val="000000"/>
+                <w:sz w:val="32"/>
+                <w:szCs w:val="40"/>
+                <w:lang w:eastAsia="en-IN" w:bidi="ml-IN"/>
+              </w:rPr>
+              <w:t>Æ</w:t>
+            </w:r>
+            <w:r>
+              <w:rPr>
+                <w:rFonts w:ascii="BRH Malayalam Extra" w:eastAsia="Times New Roman" w:hAnsi="BRH Malayalam Extra" w:cs="BRH Malayalam Extra"/>
+                <w:color w:val="000000"/>
+                <w:sz w:val="40"/>
+                <w:szCs w:val="40"/>
+                <w:lang w:eastAsia="en-IN" w:bidi="ml-IN"/>
+              </w:rPr>
+              <w:t>j</w:t>
+            </w:r>
+            <w:r>
+              <w:rPr>
+                <w:rFonts w:ascii="BRH Malayalam Extra" w:eastAsia="Times New Roman" w:hAnsi="BRH Malayalam Extra" w:cs="BRH Malayalam Extra"/>
+                <w:color w:val="000000"/>
+                <w:sz w:val="32"/>
+                <w:szCs w:val="40"/>
+                <w:highlight w:val="yellow"/>
+                <w:lang w:eastAsia="en-IN" w:bidi="ml-IN"/>
+              </w:rPr>
+              <w:t>–</w:t>
+            </w:r>
+            <w:r>
+              <w:rPr>
+                <w:rFonts w:ascii="BRH Malayalam Extra" w:eastAsia="Times New Roman" w:hAnsi="BRH Malayalam Extra" w:cs="BRH Malayalam Extra"/>
+                <w:color w:val="000000"/>
+                <w:sz w:val="40"/>
+                <w:szCs w:val="40"/>
+                <w:highlight w:val="yellow"/>
+                <w:lang w:eastAsia="en-IN" w:bidi="ml-IN"/>
+              </w:rPr>
+              <w:t>Z</w:t>
+            </w:r>
+            <w:r>
+              <w:rPr>
+                <w:rFonts w:ascii="BRH Malayalam Extra" w:eastAsia="Times New Roman" w:hAnsi="BRH Malayalam Extra" w:cs="BRH Malayalam Extra"/>
+                <w:color w:val="000000"/>
+                <w:sz w:val="40"/>
+                <w:szCs w:val="40"/>
+                <w:lang w:eastAsia="en-IN" w:bidi="ml-IN"/>
+              </w:rPr>
+              <w:t xml:space="preserve">ûi¥ax˜ | </w:t>
+            </w:r>
+          </w:p>
+          <w:p>
+            <w:pPr>
+              <w:widowControl w:val="0"/>
+              <w:autoSpaceDE w:val="0"/>
+              <w:autoSpaceDN w:val="0"/>
+              <w:adjustRightInd w:val="0"/>
+              <w:spacing w:before="0" w:line="240" w:lineRule="auto"/>
+              <w:rPr>
+                <w:rFonts w:ascii="BRH Devanagari Extra" w:hAnsi="BRH Devanagari Extra" w:cs="BRH Devanagari Extra"/>
+                <w:color w:val="000000"/>
+                <w:sz w:val="40"/>
+                <w:szCs w:val="40"/>
+              </w:rPr>
+            </w:pPr>
+            <w:r>
+              <w:rPr>
+                <w:rFonts w:ascii="BRH Malayalam Extra" w:eastAsia="Times New Roman" w:hAnsi="BRH Malayalam Extra" w:cs="BRH Malayalam Extra"/>
+                <w:color w:val="000000"/>
+                <w:sz w:val="40"/>
+                <w:szCs w:val="40"/>
+                <w:lang w:eastAsia="en-IN" w:bidi="ml-IN"/>
+              </w:rPr>
+              <w:t>s</w:t>
+            </w:r>
+            <w:r>
+              <w:rPr>
+                <w:rFonts w:ascii="BRH Malayalam Extra" w:eastAsia="Times New Roman" w:hAnsi="BRH Malayalam Extra" w:cs="BRH Malayalam Extra"/>
+                <w:color w:val="000000"/>
+                <w:sz w:val="32"/>
+                <w:szCs w:val="40"/>
+                <w:lang w:eastAsia="en-IN" w:bidi="ml-IN"/>
+              </w:rPr>
+              <w:t>–</w:t>
+            </w:r>
+            <w:r>
+              <w:rPr>
+                <w:rFonts w:ascii="BRH Malayalam Extra" w:eastAsia="Times New Roman" w:hAnsi="BRH Malayalam Extra" w:cs="BRH Malayalam Extra"/>
+                <w:color w:val="000000"/>
+                <w:sz w:val="40"/>
+                <w:szCs w:val="40"/>
+                <w:lang w:eastAsia="en-IN" w:bidi="ml-IN"/>
+              </w:rPr>
+              <w:t>I</w:t>
+            </w:r>
+            <w:r>
+              <w:rPr>
+                <w:rFonts w:ascii="BRH Devanagari Extra" w:eastAsia="Times New Roman" w:hAnsi="BRH Devanagari Extra" w:cs="BRH Malayalam Extra"/>
+                <w:color w:val="000000"/>
+                <w:sz w:val="32"/>
+                <w:szCs w:val="40"/>
+                <w:lang w:eastAsia="en-IN" w:bidi="ml-IN"/>
+              </w:rPr>
+              <w:t>Æ</w:t>
+            </w:r>
+            <w:r>
+              <w:rPr>
+                <w:rFonts w:ascii="BRH Malayalam Extra" w:eastAsia="Times New Roman" w:hAnsi="BRH Malayalam Extra" w:cs="BRH Malayalam Extra"/>
+                <w:color w:val="000000"/>
+                <w:sz w:val="40"/>
+                <w:szCs w:val="40"/>
+                <w:lang w:eastAsia="en-IN" w:bidi="ml-IN"/>
+              </w:rPr>
+              <w:t>j</w:t>
+            </w:r>
+            <w:r>
+              <w:rPr>
+                <w:rFonts w:ascii="BRH Malayalam Extra" w:eastAsia="Times New Roman" w:hAnsi="BRH Malayalam Extra" w:cs="BRH Malayalam Extra"/>
+                <w:color w:val="000000"/>
+                <w:sz w:val="32"/>
+                <w:szCs w:val="40"/>
+                <w:highlight w:val="yellow"/>
+                <w:lang w:eastAsia="en-IN" w:bidi="ml-IN"/>
+              </w:rPr>
+              <w:t>–</w:t>
+            </w:r>
+            <w:r>
+              <w:rPr>
+                <w:rFonts w:ascii="BRH Malayalam Extra" w:eastAsia="Times New Roman" w:hAnsi="BRH Malayalam Extra" w:cs="BRH Malayalam Extra"/>
+                <w:color w:val="000000"/>
+                <w:sz w:val="40"/>
+                <w:szCs w:val="40"/>
+                <w:highlight w:val="yellow"/>
+                <w:lang w:eastAsia="en-IN" w:bidi="ml-IN"/>
+              </w:rPr>
+              <w:t>Z</w:t>
+            </w:r>
+            <w:r>
+              <w:rPr>
+                <w:rFonts w:ascii="BRH Malayalam Extra" w:eastAsia="Times New Roman" w:hAnsi="BRH Malayalam Extra" w:cs="BRH Malayalam Extra"/>
+                <w:color w:val="000000"/>
+                <w:sz w:val="40"/>
+                <w:szCs w:val="40"/>
+                <w:lang w:eastAsia="en-IN" w:bidi="ml-IN"/>
+              </w:rPr>
+              <w:t>ûiyZy— sI</w:t>
+            </w:r>
+            <w:r>
+              <w:rPr>
+                <w:rFonts w:ascii="BRH Devanagari Extra" w:eastAsia="Times New Roman" w:hAnsi="BRH Devanagari Extra" w:cs="BRH Malayalam Extra"/>
+                <w:color w:val="000000"/>
+                <w:sz w:val="32"/>
+                <w:szCs w:val="40"/>
+                <w:lang w:eastAsia="en-IN" w:bidi="ml-IN"/>
+              </w:rPr>
+              <w:t>Æ</w:t>
+            </w:r>
+            <w:r>
+              <w:rPr>
+                <w:rFonts w:ascii="BRH Malayalam Extra" w:eastAsia="Times New Roman" w:hAnsi="BRH Malayalam Extra" w:cs="BRH Malayalam Extra"/>
+                <w:color w:val="000000"/>
+                <w:sz w:val="40"/>
+                <w:szCs w:val="40"/>
+                <w:lang w:eastAsia="en-IN" w:bidi="ml-IN"/>
+              </w:rPr>
+              <w:t>jZ§-ZûI |</w:t>
+            </w:r>
+          </w:p>
+        </w:tc>
+        <w:tc>
+          <w:tcPr>
+            <w:tcW w:w="5386" w:type="dxa"/>
+          </w:tcPr>
+          <w:p>
+            <w:pPr>
+              <w:widowControl w:val="0"/>
+              <w:autoSpaceDE w:val="0"/>
+              <w:autoSpaceDN w:val="0"/>
+              <w:adjustRightInd w:val="0"/>
+              <w:spacing w:before="0" w:line="240" w:lineRule="auto"/>
+              <w:rPr>
+                <w:rFonts w:ascii="BRH Malayalam Extra" w:eastAsia="Times New Roman" w:hAnsi="BRH Malayalam Extra" w:cs="BRH Malayalam Extra"/>
+                <w:color w:val="000000"/>
+                <w:sz w:val="40"/>
+                <w:szCs w:val="40"/>
+                <w:lang w:eastAsia="en-IN" w:bidi="ml-IN"/>
+              </w:rPr>
+            </w:pPr>
+            <w:r>
+              <w:rPr>
+                <w:rFonts w:ascii="BRH Malayalam Extra" w:eastAsia="Times New Roman" w:hAnsi="BRH Malayalam Extra" w:cs="BRH Malayalam Extra"/>
+                <w:color w:val="000000"/>
+                <w:sz w:val="40"/>
+                <w:szCs w:val="40"/>
+                <w:lang w:eastAsia="en-IN" w:bidi="ml-IN"/>
+              </w:rPr>
+              <w:t>s</w:t>
+            </w:r>
+            <w:r>
+              <w:rPr>
+                <w:rFonts w:ascii="BRH Malayalam Extra" w:eastAsia="Times New Roman" w:hAnsi="BRH Malayalam Extra" w:cs="BRH Malayalam Extra"/>
+                <w:color w:val="000000"/>
+                <w:sz w:val="32"/>
+                <w:szCs w:val="40"/>
+                <w:lang w:eastAsia="en-IN" w:bidi="ml-IN"/>
+              </w:rPr>
+              <w:t>–</w:t>
+            </w:r>
+            <w:r>
+              <w:rPr>
+                <w:rFonts w:ascii="BRH Malayalam Extra" w:eastAsia="Times New Roman" w:hAnsi="BRH Malayalam Extra" w:cs="BRH Malayalam Extra"/>
+                <w:color w:val="000000"/>
+                <w:sz w:val="40"/>
+                <w:szCs w:val="40"/>
+                <w:lang w:eastAsia="en-IN" w:bidi="ml-IN"/>
+              </w:rPr>
+              <w:t>I</w:t>
+            </w:r>
+            <w:r>
+              <w:rPr>
+                <w:rFonts w:ascii="BRH Devanagari Extra" w:eastAsia="Times New Roman" w:hAnsi="BRH Devanagari Extra" w:cs="BRH Malayalam Extra"/>
+                <w:color w:val="000000"/>
+                <w:sz w:val="32"/>
+                <w:szCs w:val="40"/>
+                <w:lang w:eastAsia="en-IN" w:bidi="ml-IN"/>
+              </w:rPr>
+              <w:t>Æ</w:t>
+            </w:r>
+            <w:r>
+              <w:rPr>
+                <w:rFonts w:ascii="BRH Malayalam Extra" w:eastAsia="Times New Roman" w:hAnsi="BRH Malayalam Extra" w:cs="BRH Malayalam Extra"/>
+                <w:color w:val="000000"/>
+                <w:sz w:val="40"/>
+                <w:szCs w:val="40"/>
+                <w:lang w:eastAsia="en-IN" w:bidi="ml-IN"/>
+              </w:rPr>
+              <w:t>jZx</w:t>
+            </w:r>
+            <w:r>
+              <w:rPr>
+                <w:rFonts w:ascii="BRH Devanagari Extra" w:eastAsia="Times New Roman" w:hAnsi="BRH Devanagari Extra" w:cs="BRH Malayalam Extra"/>
+                <w:color w:val="000000"/>
+                <w:sz w:val="36"/>
+                <w:szCs w:val="40"/>
+                <w:lang w:eastAsia="en-IN" w:bidi="ml-IN"/>
+              </w:rPr>
+              <w:t>óè</w:t>
+            </w:r>
+            <w:r>
+              <w:rPr>
+                <w:rFonts w:ascii="BRH Malayalam Extra" w:eastAsia="Times New Roman" w:hAnsi="BRH Malayalam Extra" w:cs="BRH Malayalam Extra"/>
+                <w:color w:val="000000"/>
+                <w:sz w:val="40"/>
+                <w:szCs w:val="40"/>
+                <w:lang w:eastAsia="en-IN" w:bidi="ml-IN"/>
+              </w:rPr>
+              <w:t>— sI</w:t>
+            </w:r>
+            <w:r>
+              <w:rPr>
+                <w:rFonts w:ascii="BRH Devanagari Extra" w:eastAsia="Times New Roman" w:hAnsi="BRH Devanagari Extra" w:cs="BRH Malayalam Extra"/>
+                <w:color w:val="000000"/>
+                <w:sz w:val="32"/>
+                <w:szCs w:val="40"/>
+                <w:lang w:eastAsia="en-IN" w:bidi="ml-IN"/>
+              </w:rPr>
+              <w:t>Æ</w:t>
+            </w:r>
+            <w:r>
+              <w:rPr>
+                <w:rFonts w:ascii="BRH Malayalam Extra" w:eastAsia="Times New Roman" w:hAnsi="BRH Malayalam Extra" w:cs="BRH Malayalam Extra"/>
+                <w:color w:val="000000"/>
+                <w:sz w:val="40"/>
+                <w:szCs w:val="40"/>
+                <w:lang w:eastAsia="en-IN" w:bidi="ml-IN"/>
+              </w:rPr>
+              <w:t>j</w:t>
+            </w:r>
+            <w:r>
+              <w:rPr>
+                <w:rFonts w:ascii="BRH Malayalam Extra" w:eastAsia="Times New Roman" w:hAnsi="BRH Malayalam Extra" w:cs="BRH Malayalam Extra"/>
+                <w:color w:val="000000"/>
+                <w:sz w:val="32"/>
+                <w:szCs w:val="40"/>
+                <w:lang w:eastAsia="en-IN" w:bidi="ml-IN"/>
+              </w:rPr>
+              <w:t>–</w:t>
+            </w:r>
+            <w:r>
+              <w:rPr>
+                <w:rFonts w:ascii="BRH Malayalam Extra" w:hAnsi="BRH Malayalam Extra" w:cs="BRH Malayalam Extra"/>
+                <w:sz w:val="40"/>
+                <w:szCs w:val="40"/>
+                <w:highlight w:val="green"/>
+              </w:rPr>
+              <w:t>À</w:t>
+            </w:r>
+            <w:r>
+              <w:rPr>
+                <w:rFonts w:ascii="BRH Malayalam Extra" w:eastAsia="Times New Roman" w:hAnsi="BRH Malayalam Extra" w:cs="BRH Malayalam Extra"/>
+                <w:color w:val="000000"/>
+                <w:sz w:val="40"/>
+                <w:szCs w:val="40"/>
+                <w:lang w:eastAsia="en-IN" w:bidi="ml-IN"/>
+              </w:rPr>
+              <w:t xml:space="preserve">ûI | </w:t>
+            </w:r>
+          </w:p>
+          <w:p>
+            <w:pPr>
+              <w:widowControl w:val="0"/>
+              <w:autoSpaceDE w:val="0"/>
+              <w:autoSpaceDN w:val="0"/>
+              <w:adjustRightInd w:val="0"/>
+              <w:spacing w:before="0" w:line="240" w:lineRule="auto"/>
+              <w:rPr>
+                <w:rFonts w:ascii="BRH Malayalam Extra" w:eastAsia="Times New Roman" w:hAnsi="BRH Malayalam Extra" w:cs="BRH Malayalam Extra"/>
+                <w:color w:val="000000"/>
+                <w:sz w:val="40"/>
+                <w:szCs w:val="40"/>
+                <w:lang w:eastAsia="en-IN" w:bidi="ml-IN"/>
+              </w:rPr>
+            </w:pPr>
+            <w:r>
+              <w:rPr>
+                <w:rFonts w:ascii="BRH Malayalam Extra" w:eastAsia="Times New Roman" w:hAnsi="BRH Malayalam Extra" w:cs="BRH Malayalam Extra"/>
+                <w:color w:val="000000"/>
+                <w:sz w:val="40"/>
+                <w:szCs w:val="40"/>
+                <w:lang w:eastAsia="en-IN" w:bidi="ml-IN"/>
+              </w:rPr>
+              <w:t>s</w:t>
+            </w:r>
+            <w:r>
+              <w:rPr>
+                <w:rFonts w:ascii="BRH Malayalam Extra" w:eastAsia="Times New Roman" w:hAnsi="BRH Malayalam Extra" w:cs="BRH Malayalam Extra"/>
+                <w:color w:val="000000"/>
+                <w:sz w:val="32"/>
+                <w:szCs w:val="40"/>
+                <w:lang w:eastAsia="en-IN" w:bidi="ml-IN"/>
+              </w:rPr>
+              <w:t>–</w:t>
+            </w:r>
+            <w:r>
+              <w:rPr>
+                <w:rFonts w:ascii="BRH Malayalam Extra" w:eastAsia="Times New Roman" w:hAnsi="BRH Malayalam Extra" w:cs="BRH Malayalam Extra"/>
+                <w:color w:val="000000"/>
+                <w:sz w:val="40"/>
+                <w:szCs w:val="40"/>
+                <w:lang w:eastAsia="en-IN" w:bidi="ml-IN"/>
+              </w:rPr>
+              <w:t>I</w:t>
+            </w:r>
+            <w:r>
+              <w:rPr>
+                <w:rFonts w:ascii="BRH Devanagari Extra" w:eastAsia="Times New Roman" w:hAnsi="BRH Devanagari Extra" w:cs="BRH Malayalam Extra"/>
+                <w:color w:val="000000"/>
+                <w:sz w:val="32"/>
+                <w:szCs w:val="40"/>
+                <w:lang w:eastAsia="en-IN" w:bidi="ml-IN"/>
+              </w:rPr>
+              <w:t>Æ</w:t>
+            </w:r>
+            <w:r>
+              <w:rPr>
+                <w:rFonts w:ascii="BRH Malayalam Extra" w:eastAsia="Times New Roman" w:hAnsi="BRH Malayalam Extra" w:cs="BRH Malayalam Extra"/>
+                <w:color w:val="000000"/>
+                <w:sz w:val="40"/>
+                <w:szCs w:val="40"/>
+                <w:lang w:eastAsia="en-IN" w:bidi="ml-IN"/>
+              </w:rPr>
+              <w:t>j</w:t>
+            </w:r>
+            <w:r>
+              <w:rPr>
+                <w:rFonts w:ascii="BRH Malayalam Extra" w:eastAsia="Times New Roman" w:hAnsi="BRH Malayalam Extra" w:cs="BRH Malayalam Extra"/>
+                <w:color w:val="000000"/>
+                <w:sz w:val="32"/>
+                <w:szCs w:val="40"/>
+                <w:highlight w:val="yellow"/>
+                <w:lang w:eastAsia="en-IN" w:bidi="ml-IN"/>
+              </w:rPr>
+              <w:t>–</w:t>
+            </w:r>
+            <w:r>
+              <w:rPr>
+                <w:rFonts w:ascii="BRH Malayalam Extra" w:hAnsi="BRH Malayalam Extra" w:cs="BRH Malayalam Extra"/>
+                <w:sz w:val="40"/>
+                <w:szCs w:val="40"/>
+                <w:highlight w:val="green"/>
+              </w:rPr>
+              <w:t>À</w:t>
+            </w:r>
+            <w:r>
+              <w:rPr>
+                <w:rFonts w:ascii="BRH Malayalam Extra" w:eastAsia="Times New Roman" w:hAnsi="BRH Malayalam Extra" w:cs="BRH Malayalam Extra"/>
+                <w:color w:val="000000"/>
+                <w:sz w:val="40"/>
+                <w:szCs w:val="40"/>
+                <w:lang w:eastAsia="en-IN" w:bidi="ml-IN"/>
+              </w:rPr>
+              <w:t xml:space="preserve">ûi¥ax˜ | </w:t>
+            </w:r>
+          </w:p>
+          <w:p>
+            <w:pPr>
+              <w:widowControl w:val="0"/>
+              <w:autoSpaceDE w:val="0"/>
+              <w:autoSpaceDN w:val="0"/>
+              <w:adjustRightInd w:val="0"/>
+              <w:spacing w:before="0" w:line="240" w:lineRule="auto"/>
+              <w:rPr>
+                <w:rFonts w:ascii="BRH Devanagari Extra" w:hAnsi="BRH Devanagari Extra" w:cs="BRH Devanagari Extra"/>
+                <w:color w:val="000000"/>
+                <w:sz w:val="40"/>
+                <w:szCs w:val="40"/>
+              </w:rPr>
+            </w:pPr>
+            <w:r>
+              <w:rPr>
+                <w:rFonts w:ascii="BRH Malayalam Extra" w:eastAsia="Times New Roman" w:hAnsi="BRH Malayalam Extra" w:cs="BRH Malayalam Extra"/>
+                <w:color w:val="000000"/>
+                <w:sz w:val="40"/>
+                <w:szCs w:val="40"/>
+                <w:lang w:eastAsia="en-IN" w:bidi="ml-IN"/>
+              </w:rPr>
+              <w:t>s</w:t>
+            </w:r>
+            <w:r>
+              <w:rPr>
+                <w:rFonts w:ascii="BRH Malayalam Extra" w:eastAsia="Times New Roman" w:hAnsi="BRH Malayalam Extra" w:cs="BRH Malayalam Extra"/>
+                <w:color w:val="000000"/>
+                <w:sz w:val="32"/>
+                <w:szCs w:val="40"/>
+                <w:lang w:eastAsia="en-IN" w:bidi="ml-IN"/>
+              </w:rPr>
+              <w:t>–</w:t>
+            </w:r>
+            <w:r>
+              <w:rPr>
+                <w:rFonts w:ascii="BRH Malayalam Extra" w:eastAsia="Times New Roman" w:hAnsi="BRH Malayalam Extra" w:cs="BRH Malayalam Extra"/>
+                <w:color w:val="000000"/>
+                <w:sz w:val="40"/>
+                <w:szCs w:val="40"/>
+                <w:lang w:eastAsia="en-IN" w:bidi="ml-IN"/>
+              </w:rPr>
+              <w:t>I</w:t>
+            </w:r>
+            <w:r>
+              <w:rPr>
+                <w:rFonts w:ascii="BRH Devanagari Extra" w:eastAsia="Times New Roman" w:hAnsi="BRH Devanagari Extra" w:cs="BRH Malayalam Extra"/>
+                <w:color w:val="000000"/>
+                <w:sz w:val="32"/>
+                <w:szCs w:val="40"/>
+                <w:lang w:eastAsia="en-IN" w:bidi="ml-IN"/>
+              </w:rPr>
+              <w:t>Æ</w:t>
+            </w:r>
+            <w:r>
+              <w:rPr>
+                <w:rFonts w:ascii="BRH Malayalam Extra" w:eastAsia="Times New Roman" w:hAnsi="BRH Malayalam Extra" w:cs="BRH Malayalam Extra"/>
+                <w:color w:val="000000"/>
+                <w:sz w:val="40"/>
+                <w:szCs w:val="40"/>
+                <w:lang w:eastAsia="en-IN" w:bidi="ml-IN"/>
+              </w:rPr>
+              <w:t>j</w:t>
+            </w:r>
+            <w:r>
+              <w:rPr>
+                <w:rFonts w:ascii="BRH Malayalam Extra" w:eastAsia="Times New Roman" w:hAnsi="BRH Malayalam Extra" w:cs="BRH Malayalam Extra"/>
+                <w:color w:val="000000"/>
+                <w:sz w:val="32"/>
+                <w:szCs w:val="40"/>
+                <w:highlight w:val="yellow"/>
+                <w:lang w:eastAsia="en-IN" w:bidi="ml-IN"/>
+              </w:rPr>
+              <w:t>–</w:t>
+            </w:r>
+            <w:r>
+              <w:rPr>
+                <w:rFonts w:ascii="BRH Malayalam Extra" w:hAnsi="BRH Malayalam Extra" w:cs="BRH Malayalam Extra"/>
+                <w:sz w:val="40"/>
+                <w:szCs w:val="40"/>
+                <w:highlight w:val="green"/>
+              </w:rPr>
+              <w:t>À</w:t>
+            </w:r>
+            <w:r>
+              <w:rPr>
+                <w:rFonts w:ascii="BRH Malayalam Extra" w:eastAsia="Times New Roman" w:hAnsi="BRH Malayalam Extra" w:cs="BRH Malayalam Extra"/>
+                <w:color w:val="000000"/>
+                <w:sz w:val="40"/>
+                <w:szCs w:val="40"/>
+                <w:lang w:eastAsia="en-IN" w:bidi="ml-IN"/>
+              </w:rPr>
+              <w:t>ûiyZy— sI</w:t>
+            </w:r>
+            <w:r>
+              <w:rPr>
+                <w:rFonts w:ascii="BRH Devanagari Extra" w:eastAsia="Times New Roman" w:hAnsi="BRH Devanagari Extra" w:cs="BRH Malayalam Extra"/>
+                <w:color w:val="000000"/>
+                <w:sz w:val="32"/>
+                <w:szCs w:val="40"/>
+                <w:lang w:eastAsia="en-IN" w:bidi="ml-IN"/>
+              </w:rPr>
+              <w:t>Æ</w:t>
+            </w:r>
+            <w:r>
+              <w:rPr>
+                <w:rFonts w:ascii="BRH Malayalam Extra" w:eastAsia="Times New Roman" w:hAnsi="BRH Malayalam Extra" w:cs="BRH Malayalam Extra"/>
+                <w:color w:val="000000"/>
+                <w:sz w:val="40"/>
+                <w:szCs w:val="40"/>
+                <w:lang w:eastAsia="en-IN" w:bidi="ml-IN"/>
+              </w:rPr>
+              <w:t>jZ§-ZûI |</w:t>
             </w:r>
           </w:p>
         </w:tc>
@@ -3527,9 +6300,18 @@
           <w:sz w:val="32"/>
           <w:szCs w:val="32"/>
           <w:u w:val="single"/>
-          <w:lang w:val="it-IT"/>
         </w:rPr>
       </w:pPr>
+      <w:r>
+        <w:rPr>
+          <w:b/>
+          <w:bCs/>
+          <w:sz w:val="32"/>
+          <w:szCs w:val="32"/>
+          <w:u w:val="single"/>
+        </w:rPr>
+        <w:t>==============</w:t>
+      </w:r>
     </w:p>
     <w:p>
       <w:pPr>
@@ -3540,7 +6322,6 @@
           <w:sz w:val="32"/>
           <w:szCs w:val="32"/>
           <w:u w:val="single"/>
-          <w:lang w:val="it-IT"/>
         </w:rPr>
       </w:pPr>
     </w:p>
@@ -4053,7 +6834,6 @@
                 <w:sz w:val="28"/>
                 <w:szCs w:val="32"/>
               </w:rPr>
-              <w:lastRenderedPageBreak/>
               <w:t>T.S.5.2.4.2</w:t>
             </w:r>
             <w:r>
@@ -4465,6 +7245,7 @@
                 <w:sz w:val="28"/>
                 <w:szCs w:val="32"/>
               </w:rPr>
+              <w:lastRenderedPageBreak/>
               <w:t>T.S.5.2.5.6</w:t>
             </w:r>
             <w:r>
@@ -5677,30 +8458,6 @@
         </w:rPr>
         <w:t>============</w:t>
       </w:r>
-    </w:p>
-    <w:p>
-      <w:pPr>
-        <w:jc w:val="center"/>
-        <w:rPr>
-          <w:b/>
-          <w:bCs/>
-          <w:sz w:val="32"/>
-          <w:szCs w:val="32"/>
-          <w:u w:val="single"/>
-        </w:rPr>
-      </w:pPr>
-    </w:p>
-    <w:p>
-      <w:pPr>
-        <w:jc w:val="center"/>
-        <w:rPr>
-          <w:b/>
-          <w:bCs/>
-          <w:sz w:val="32"/>
-          <w:szCs w:val="32"/>
-          <w:u w:val="single"/>
-        </w:rPr>
-      </w:pPr>
     </w:p>
     <w:p>
       <w:pPr>
@@ -6131,7 +8888,6 @@
                 <w:szCs w:val="40"/>
                 <w:lang w:val="en-IN" w:eastAsia="en-IN" w:bidi="ml-IN"/>
               </w:rPr>
-              <w:lastRenderedPageBreak/>
               <w:t>Q¥Éx—hy</w:t>
             </w:r>
             <w:r>
@@ -6263,7 +9019,6 @@
                 <w:szCs w:val="40"/>
                 <w:lang w:val="en-IN" w:eastAsia="en-IN" w:bidi="ml-IN"/>
               </w:rPr>
-              <w:lastRenderedPageBreak/>
               <w:t>Q¥Éx—hy</w:t>
             </w:r>
             <w:r>
@@ -6321,7 +9076,6 @@
                 <w:szCs w:val="40"/>
                 <w:lang w:val="en-IN" w:eastAsia="en-IN" w:bidi="ml-IN"/>
               </w:rPr>
-              <w:lastRenderedPageBreak/>
               <w:t>Q¥Éx—hy</w:t>
             </w:r>
             <w:r>
@@ -6486,7 +9240,6 @@
                 <w:sz w:val="28"/>
                 <w:szCs w:val="32"/>
               </w:rPr>
-              <w:lastRenderedPageBreak/>
               <w:t>T.S.</w:t>
             </w:r>
             <w:r>
@@ -6788,6 +9541,7 @@
                 <w:szCs w:val="40"/>
                 <w:lang w:val="it-IT" w:eastAsia="en-IN" w:bidi="ml-IN"/>
               </w:rPr>
+              <w:lastRenderedPageBreak/>
               <w:t>eky-Bp—ªZ¥Ç |</w:t>
             </w:r>
           </w:p>
@@ -6819,6 +9573,7 @@
                 <w:szCs w:val="40"/>
                 <w:lang w:val="it-IT" w:eastAsia="en-IN" w:bidi="ml-IN"/>
               </w:rPr>
+              <w:lastRenderedPageBreak/>
               <w:t>e</w:t>
             </w:r>
             <w:r>
@@ -6963,6 +9718,7 @@
                 <w:szCs w:val="40"/>
                 <w:lang w:val="it-IT" w:eastAsia="en-IN" w:bidi="ml-IN"/>
               </w:rPr>
+              <w:lastRenderedPageBreak/>
               <w:t>eky-Bp—ªZ¥Ç |</w:t>
             </w:r>
           </w:p>
@@ -7001,6 +9757,7 @@
                 <w:sz w:val="28"/>
                 <w:szCs w:val="32"/>
               </w:rPr>
+              <w:lastRenderedPageBreak/>
               <w:t>T.S.5.2.5.5 – Kramam</w:t>
             </w:r>
           </w:p>
@@ -8562,7 +11319,6 @@
                 <w:sz w:val="28"/>
                 <w:szCs w:val="32"/>
               </w:rPr>
-              <w:lastRenderedPageBreak/>
               <w:t>T.S.5.2.9.2 – Kramam</w:t>
             </w:r>
           </w:p>
@@ -9195,6 +11951,7 @@
                 <w:sz w:val="28"/>
                 <w:szCs w:val="32"/>
               </w:rPr>
+              <w:lastRenderedPageBreak/>
               <w:t>T.S.5.2.11.1 – Kramam</w:t>
             </w:r>
           </w:p>
@@ -9581,16 +12338,7 @@
           <w:bCs/>
           <w:sz w:val="32"/>
         </w:rPr>
-        <w:t xml:space="preserve">replaced </w:t>
-      </w:r>
-      <w:proofErr w:type="gramStart"/>
-      <w:r>
-        <w:rPr>
-          <w:b/>
-          <w:bCs/>
-          <w:sz w:val="32"/>
-        </w:rPr>
-        <w:t>with</w:t>
+        <w:t>replaced with</w:t>
       </w:r>
       <w:r>
         <w:rPr>
@@ -9612,7 +12360,6 @@
         </w:rPr>
         <w:t>"</w:t>
       </w:r>
-      <w:proofErr w:type="gramEnd"/>
       <w:r>
         <w:rPr>
           <w:rFonts w:ascii="BRH Malayalam" w:hAnsi="BRH Malayalam" w:cs="BRH Malayalam"/>
@@ -9624,7 +12371,6 @@
         </w:rPr>
         <w:t>q§T</w:t>
       </w:r>
-      <w:proofErr w:type="gramStart"/>
       <w:r>
         <w:rPr>
           <w:rFonts w:ascii="BRH Malayalam" w:hAnsi="BRH Malayalam" w:cs="BRH Malayalam"/>
@@ -9641,16 +12387,7 @@
           <w:bCs/>
           <w:sz w:val="32"/>
         </w:rPr>
-        <w:t>wherever</w:t>
-      </w:r>
-      <w:proofErr w:type="gramEnd"/>
-      <w:r>
-        <w:rPr>
-          <w:b/>
-          <w:bCs/>
-          <w:sz w:val="32"/>
-        </w:rPr>
-        <w:t xml:space="preserve"> applicable</w:t>
+        <w:t>wherever applicable</w:t>
       </w:r>
     </w:p>
     <w:p>
@@ -9674,30 +12411,6 @@
         </w:rPr>
         <w:t>=========================</w:t>
       </w:r>
-    </w:p>
-    <w:p>
-      <w:pPr>
-        <w:jc w:val="center"/>
-        <w:rPr>
-          <w:b/>
-          <w:bCs/>
-          <w:sz w:val="32"/>
-          <w:szCs w:val="32"/>
-          <w:u w:val="single"/>
-        </w:rPr>
-      </w:pPr>
-    </w:p>
-    <w:p>
-      <w:pPr>
-        <w:jc w:val="center"/>
-        <w:rPr>
-          <w:b/>
-          <w:bCs/>
-          <w:sz w:val="32"/>
-          <w:szCs w:val="32"/>
-          <w:u w:val="single"/>
-        </w:rPr>
-      </w:pPr>
     </w:p>
     <w:p>
       <w:pPr>

</xml_diff>